<commit_message>
docs: atualiza DOCX com estado atual + regras negocio detalhadas
- 25 secoes: arquitetura, modelo, auth, canais, regras por perfil
  (publico, cliente, profissional, admin), pacotes, NPS, marketing,
  lista espera, termos, LGPD, seguranca, integracoes, observability,
  infra, API, testes, env vars, escala, email sync, roadmap
- Regra comunicacao atualizada: OTP=SMS exclusivo (Zenvia), Email=promo/
  marketing/pacotes/compras, WhatsApp=D-1+NPS
- Endpoints cron documentados (8 jobs)
- Todas env vars listadas com obrigatoriedade
- Portugues revisado com acentuacao
</commit_message>
<xml_diff>
--- a/docs/Shiva_Zen_Documentacao_Tecnica.docx
+++ b/docs/Shiva_Zen_Documentacao_Tecnica.docx
@@ -24,7 +24,7 @@
           <w:color w:val="7F8C8D"/>
           <w:sz w:val="32"/>
         </w:rPr>
-        <w:t>Sistema de Gestao de Clinica de Estetica</w:t>
+        <w:t>Sistema de Gestão de Clínica de Estética</w:t>
       </w:r>
     </w:p>
     <w:p/>
@@ -38,7 +38,7 @@
           <w:i/>
           <w:sz w:val="26"/>
         </w:rPr>
-        <w:t>Documentacao Tecnica de Arquitetura e Infraestrutura</w:t>
+        <w:t>Documentação Técnica Completa — Arquitetura, Infraestrutura e Regras de Negócio</w:t>
       </w:r>
     </w:p>
     <w:p/>
@@ -50,7 +50,7 @@
         <w:rPr>
           <w:sz w:val="22"/>
         </w:rPr>
-        <w:t>Versao 1.0 | Abril 2026</w:t>
+        <w:t>Versão 2.0 | Abril 2026</w:t>
         <w:br/>
       </w:r>
       <w:r>
@@ -70,7 +70,7 @@
         <w:pStyle w:val="Heading1"/>
       </w:pPr>
       <w:r>
-        <w:t>Indice</w:t>
+        <w:t>Índice</w:t>
       </w:r>
     </w:p>
     <w:p>
@@ -78,7 +78,7 @@
         <w:pStyle w:val="ListNumber"/>
       </w:pPr>
       <w:r>
-        <w:t>1. Visao Geral</w:t>
+        <w:t>1. Visão Geral</w:t>
       </w:r>
     </w:p>
     <w:p>
@@ -86,7 +86,7 @@
         <w:pStyle w:val="ListNumber"/>
       </w:pPr>
       <w:r>
-        <w:t>2. Arquitetura da Aplicacao</w:t>
+        <w:t>2. Arquitetura da Aplicação</w:t>
       </w:r>
     </w:p>
     <w:p>
@@ -102,7 +102,7 @@
         <w:pStyle w:val="ListNumber"/>
       </w:pPr>
       <w:r>
-        <w:t>4. Autenticacao e Autorizacao</w:t>
+        <w:t>4. Autenticação e Autorização</w:t>
       </w:r>
     </w:p>
     <w:p>
@@ -110,7 +110,7 @@
         <w:pStyle w:val="ListNumber"/>
       </w:pPr>
       <w:r>
-        <w:t>5. Fluxo de Agendamento Publico</w:t>
+        <w:t>5. Comunicação Multi-Canal</w:t>
       </w:r>
     </w:p>
     <w:p>
@@ -118,7 +118,7 @@
         <w:pStyle w:val="ListNumber"/>
       </w:pPr>
       <w:r>
-        <w:t>6. Comunicacao Multi-Canal</w:t>
+        <w:t>6. Regras de Negócio — Agendamento Público</w:t>
       </w:r>
     </w:p>
     <w:p>
@@ -126,7 +126,7 @@
         <w:pStyle w:val="ListNumber"/>
       </w:pPr>
       <w:r>
-        <w:t>7. Seguranca</w:t>
+        <w:t>7. Regras de Negócio — Portal do Cliente</w:t>
       </w:r>
     </w:p>
     <w:p>
@@ -134,7 +134,7 @@
         <w:pStyle w:val="ListNumber"/>
       </w:pPr>
       <w:r>
-        <w:t>8. LGPD e Compliance</w:t>
+        <w:t>8. Regras de Negócio — Portal do Profissional</w:t>
       </w:r>
     </w:p>
     <w:p>
@@ -142,7 +142,7 @@
         <w:pStyle w:val="ListNumber"/>
       </w:pPr>
       <w:r>
-        <w:t>9. Integracoes Externas</w:t>
+        <w:t>9. Regras de Negócio — Painel Administrativo</w:t>
       </w:r>
     </w:p>
     <w:p>
@@ -150,7 +150,7 @@
         <w:pStyle w:val="ListNumber"/>
       </w:pPr>
       <w:r>
-        <w:t>10. Observabilidade</w:t>
+        <w:t>10. Regras de Negócio — Pacotes de Sessões</w:t>
       </w:r>
     </w:p>
     <w:p>
@@ -158,7 +158,7 @@
         <w:pStyle w:val="ListNumber"/>
       </w:pPr>
       <w:r>
-        <w:t>11. Infraestrutura e Deploy</w:t>
+        <w:t>11. Regras de Negócio — NPS e Satisfação</w:t>
       </w:r>
     </w:p>
     <w:p>
@@ -166,7 +166,7 @@
         <w:pStyle w:val="ListNumber"/>
       </w:pPr>
       <w:r>
-        <w:t>12. API REST</w:t>
+        <w:t>12. Regras de Negócio — Marketing e Promoções</w:t>
       </w:r>
     </w:p>
     <w:p>
@@ -174,7 +174,7 @@
         <w:pStyle w:val="ListNumber"/>
       </w:pPr>
       <w:r>
-        <w:t>13. Testes</w:t>
+        <w:t>13. Regras de Negócio — Lista de Espera</w:t>
       </w:r>
     </w:p>
     <w:p>
@@ -182,7 +182,7 @@
         <w:pStyle w:val="ListNumber"/>
       </w:pPr>
       <w:r>
-        <w:t>14. Variaveis de Ambiente</w:t>
+        <w:t>14. Regras de Negócio — Termos e Consentimentos</w:t>
       </w:r>
     </w:p>
     <w:p>
@@ -190,7 +190,7 @@
         <w:pStyle w:val="ListNumber"/>
       </w:pPr>
       <w:r>
-        <w:t>15. Limites de Escala</w:t>
+        <w:t>15. LGPD e Compliance</w:t>
       </w:r>
     </w:p>
     <w:p>
@@ -198,7 +198,7 @@
         <w:pStyle w:val="ListNumber"/>
       </w:pPr>
       <w:r>
-        <w:t>16. E-mail Sincrono (decisao corrente)</w:t>
+        <w:t>16. Segurança</w:t>
       </w:r>
     </w:p>
     <w:p>
@@ -206,7 +206,71 @@
         <w:pStyle w:val="ListNumber"/>
       </w:pPr>
       <w:r>
-        <w:t>17. Roadmap Infraestrutura</w:t>
+        <w:t>17. Integrações Externas</w:t>
+      </w:r>
+    </w:p>
+    <w:p>
+      <w:pPr>
+        <w:pStyle w:val="ListNumber"/>
+      </w:pPr>
+      <w:r>
+        <w:t>18. Observabilidade</w:t>
+      </w:r>
+    </w:p>
+    <w:p>
+      <w:pPr>
+        <w:pStyle w:val="ListNumber"/>
+      </w:pPr>
+      <w:r>
+        <w:t>19. Infraestrutura e Deploy</w:t>
+      </w:r>
+    </w:p>
+    <w:p>
+      <w:pPr>
+        <w:pStyle w:val="ListNumber"/>
+      </w:pPr>
+      <w:r>
+        <w:t>20. API REST</w:t>
+      </w:r>
+    </w:p>
+    <w:p>
+      <w:pPr>
+        <w:pStyle w:val="ListNumber"/>
+      </w:pPr>
+      <w:r>
+        <w:t>21. Testes</w:t>
+      </w:r>
+    </w:p>
+    <w:p>
+      <w:pPr>
+        <w:pStyle w:val="ListNumber"/>
+      </w:pPr>
+      <w:r>
+        <w:t>22. Variáveis de Ambiente</w:t>
+      </w:r>
+    </w:p>
+    <w:p>
+      <w:pPr>
+        <w:pStyle w:val="ListNumber"/>
+      </w:pPr>
+      <w:r>
+        <w:t>23. Limites de Escala</w:t>
+      </w:r>
+    </w:p>
+    <w:p>
+      <w:pPr>
+        <w:pStyle w:val="ListNumber"/>
+      </w:pPr>
+      <w:r>
+        <w:t>24. E-mail Síncrono (decisão corrente)</w:t>
+      </w:r>
+    </w:p>
+    <w:p>
+      <w:pPr>
+        <w:pStyle w:val="ListNumber"/>
+      </w:pPr>
+      <w:r>
+        <w:t>25. Roadmap de Infraestrutura</w:t>
       </w:r>
     </w:p>
     <w:p>
@@ -219,22 +283,22 @@
         <w:pStyle w:val="Heading1"/>
       </w:pPr>
       <w:r>
-        <w:t>1. Visao Geral</w:t>
+        <w:t>1. Visão Geral</w:t>
       </w:r>
     </w:p>
     <w:p>
       <w:r>
-        <w:t>O Shiva Zen e uma plataforma web monolitica (Django 5.2.1 + Python 3.14) para gerenciamento de uma clinica de estetica de pequeno porte (aproximadamente 40 clientes/mes). A plataforma cobre o ciclo completo: agendamento publico sem login, portal do cliente, portal do profissional, painel administrativo, prontuario eletronico, pacotes de sessoes, pesquisa NPS pos-atendimento, campanhas de e-mail marketing com consent LGPD granular e auditoria de operacoes sensiveis.</w:t>
+        <w:t>O Shiva Zen é uma plataforma web monolítica (Django 5.2.1 + Python 3.14) para gestão de uma clínica de estética de pequeno porte (aproximadamente 40 clientes/mês). Cobre o ciclo completo: agendamento público sem login, portal do cliente, portal do profissional, painel administrativo, prontuário eletrônico, pacotes de sessões, pesquisa NPS pós-atendimento, campanhas de e-mail marketing com consentimento LGPD granular e auditoria de operações sensíveis.</w:t>
       </w:r>
     </w:p>
     <w:p>
       <w:r>
-        <w:t>A arquitetura e Django MVT classico, sem SPA. Templates renderizados no servidor com progressive enhancement via fetch. Um service worker PWA e habilitado apenas no painel administrativo. Uma API REST v1 (DRF + drf-spectacular / OpenAPI) esta disponivel em /api/ para futuras integracoes, mas o fluxo principal opera com HTTP tradicional e forms.</w:t>
+        <w:t>Arquitetura: Django MVT clássico, sem SPA. Templates renderizados no servidor com progressive enhancement via fetch. Service worker PWA habilitado apenas no painel administrativo. API REST v1 (DRF + drf-spectacular / OpenAPI) exposta em /api/ para futuras integrações; o fluxo principal opera com HTTP tradicional e formulários.</w:t>
       </w:r>
     </w:p>
     <w:p>
       <w:r>
-        <w:t>Deploy atual: Railway free tier (web + Postgres). Celery e Redis foram removidos em favor de envio de e-mail sincrono e cron externo HTTP (cron-job.org) para jobs agendados, reduzindo custo para zero.</w:t>
+        <w:t>Deploy atual: Railway free tier (web + Postgres). Celery e Redis foram removidos em favor de envio de e-mail síncrono e cron externo HTTP (cron-job.org) para jobs agendados, mantendo custo em zero.</w:t>
       </w:r>
     </w:p>
     <w:p>
@@ -242,12 +306,12 @@
         <w:pStyle w:val="Heading1"/>
       </w:pPr>
       <w:r>
-        <w:t>2. Arquitetura da Aplicacao</w:t>
+        <w:t>2. Arquitetura da Aplicação</w:t>
       </w:r>
     </w:p>
     <w:p>
       <w:r>
-        <w:t>O codigo esta organizado em app Django unica (`app_shivazen`) com separacao por responsabilidade:</w:t>
+        <w:t>Código organizado em uma app Django única (app_shivazen) com separação por responsabilidade:</w:t>
       </w:r>
     </w:p>
     <w:p>
@@ -255,7 +319,7 @@
         <w:pStyle w:val="ListBullet"/>
       </w:pPr>
       <w:r>
-        <w:t>models/: 39 modelos distribuidos em 11 arquivos por dominio (acesso, agendamentos, clientes, pacotes, procedimentos, profissionais, prontuario, sistema, nps, termos, mixins).</w:t>
+        <w:t>models/: 39 modelos em 11 arquivos por domínio (acesso, agendamentos, clientes, pacotes, procedimentos, profissionais, prontuário, sistema, nps, termos, mixins).</w:t>
       </w:r>
     </w:p>
     <w:p>
@@ -263,7 +327,7 @@
         <w:pStyle w:val="ListBullet"/>
       </w:pPr>
       <w:r>
-        <w:t>views/: 15+ modulos separados por contexto (publico, booking, dashboard, admin, prontuario, profissional, whatsapp, lgpd, cron, health).</w:t>
+        <w:t>views/: 18 módulos separados por contexto (público, booking, dashboard, admin, admin_management, admin_promotions, admin_professional, prontuário, profissional, whatsapp, lgpd, cron, health, auth, notificações, pacotes, booking_api, __init__).</w:t>
       </w:r>
     </w:p>
     <w:p>
@@ -271,7 +335,7 @@
         <w:pStyle w:val="ListBullet"/>
       </w:pPr>
       <w:r>
-        <w:t>services/: camada de logica de negocio (agendamento, lgpd, otp, notificacao, auditoria, pacote).</w:t>
+        <w:t>services/: camada de regras de negócio (agendamento, lgpd, otp, notificacao, auditoria, pacote).</w:t>
       </w:r>
     </w:p>
     <w:p>
@@ -287,7 +351,7 @@
         <w:pStyle w:val="ListBullet"/>
       </w:pPr>
       <w:r>
-        <w:t>forms/: Django Forms com validacao por recurso.</w:t>
+        <w:t>forms/: Django Forms com validação por recurso.</w:t>
       </w:r>
     </w:p>
     <w:p>
@@ -303,7 +367,7 @@
         <w:pStyle w:val="ListBullet"/>
       </w:pPr>
       <w:r>
-        <w:t>tasks.py: funcoes decoradas @shared_task (rodadas sincronas via endpoint cron).</w:t>
+        <w:t>tasks.py: funções @shared_task, executadas síncronas via endpoint /cron/run/.</w:t>
       </w:r>
     </w:p>
     <w:p>
@@ -319,7 +383,7 @@
         <w:pStyle w:val="ListBullet"/>
       </w:pPr>
       <w:r>
-        <w:t>signals.py: hooks do Django (auditoria, derivacoes de status).</w:t>
+        <w:t>signals.py: hooks Django (auditoria, derivações de status).</w:t>
       </w:r>
     </w:p>
     <w:p>
@@ -327,7 +391,7 @@
         <w:pStyle w:val="ListBullet"/>
       </w:pPr>
       <w:r>
-        <w:t>validators.py: validadores reutilizaveis (CPF, telefone BR, etc).</w:t>
+        <w:t>validators.py: validadores reutilizáveis (CPF, telefone BR, data de nascimento).</w:t>
       </w:r>
     </w:p>
     <w:p>
@@ -340,7 +404,7 @@
     </w:p>
     <w:p>
       <w:r>
-        <w:t>O banco e PostgreSQL em producao (Railway managed). 39 modelos agrupados em dominios logicos. Principais:</w:t>
+        <w:t>Banco PostgreSQL em produção (Railway managed). 39 modelos agrupados por domínio. Detalhamento:</w:t>
       </w:r>
     </w:p>
     <w:tbl>
@@ -361,7 +425,7 @@
           </w:tcPr>
           <w:p>
             <w:r>
-              <w:t>Dominio</w:t>
+              <w:t>Domínio</w:t>
             </w:r>
           </w:p>
         </w:tc>
@@ -371,7 +435,7 @@
           </w:tcPr>
           <w:p>
             <w:r>
-              <w:t>Modelos</w:t>
+              <w:t>Modelos principais</w:t>
             </w:r>
           </w:p>
         </w:tc>
@@ -413,7 +477,7 @@
           </w:tcPr>
           <w:p>
             <w:r>
-              <w:t>Auth customizada + ACL por perfil + OTP para clientes.</w:t>
+              <w:t>Autenticação customizada (USERNAME_FIELD=email) com ACL por perfil. OTPCode armazena códigos com TTL, tentativas, canal (SMS/EMAIL), IP.</w:t>
             </w:r>
           </w:p>
         </w:tc>
@@ -445,7 +509,7 @@
           </w:tcPr>
           <w:p>
             <w:r>
-              <w:t>Dados pessoais + consent granular LGPD por canal.</w:t>
+              <w:t>Dados pessoais + consentimentos granulares: aceita_comunicacao (legado), consent_email_marketing, consent_whatsapp_nps, consent_whatsapp_confirmacao — cada um com timestamp e IP de origem para trilha de auditoria LGPD. Token de unsubscribe único.</w:t>
             </w:r>
           </w:p>
         </w:tc>
@@ -467,7 +531,7 @@
           </w:tcPr>
           <w:p>
             <w:r>
-              <w:t>Atendimento, Bloqueio, ListaEspera, Feriado</w:t>
+              <w:t>Atendimento, Notificacao, Bloqueio, ListaEspera, Feriado</w:t>
             </w:r>
           </w:p>
         </w:tc>
@@ -477,7 +541,7 @@
           </w:tcPr>
           <w:p>
             <w:r>
-              <w:t>Core: reservas, locks por horario, bloqueios e feriados BR.</w:t>
+              <w:t>Core. Atendimento tem 7 status: PENDENTE, AGENDADO, CONFIRMADO, REALIZADO, CANCELADO, FALTOU, REAGENDADO. Notificacao rastreia envios por canal (WHATSAPP/SMS/EMAIL) e tipo.</w:t>
             </w:r>
           </w:p>
         </w:tc>
@@ -499,7 +563,7 @@
           </w:tcPr>
           <w:p>
             <w:r>
-              <w:t>Procedimento, CategoriaProcedimento, ProfissionalProcedimento</w:t>
+              <w:t>Procedimento, CategoriaProcedimento, ProfissionalProcedimento, Promocao</w:t>
             </w:r>
           </w:p>
         </w:tc>
@@ -509,7 +573,7 @@
           </w:tcPr>
           <w:p>
             <w:r>
-              <w:t>Catalogo de servicos e relacao com profissionais.</w:t>
+              <w:t>Catálogo de serviços, categorias, relação M2M com profissionais. Slug e imagem para página pública.</w:t>
             </w:r>
           </w:p>
         </w:tc>
@@ -531,7 +595,7 @@
           </w:tcPr>
           <w:p>
             <w:r>
-              <w:t>Pacote, PacoteCliente, SessaoPacote</w:t>
+              <w:t>Pacote, ItemPacote, PacoteCliente, SessaoPacote</w:t>
             </w:r>
           </w:p>
         </w:tc>
@@ -541,7 +605,7 @@
           </w:tcPr>
           <w:p>
             <w:r>
-              <w:t>Venda de pacotes de sessoes e consumo por sessao.</w:t>
+              <w:t>Venda de pacotes de sessões. ItemPacote define quantidade por procedimento. SessaoPacote registra consumo vinculado a atendimento.</w:t>
             </w:r>
           </w:p>
         </w:tc>
@@ -573,7 +637,7 @@
           </w:tcPr>
           <w:p>
             <w:r>
-              <w:t>Cadastro, disponibilidade e aprovacao pelo admin.</w:t>
+              <w:t>Cadastro completo, disponibilidade por dia/semana, fluxo de aprovação pelo admin antes de ativação.</w:t>
             </w:r>
           </w:p>
         </w:tc>
@@ -585,7 +649,7 @@
           </w:tcPr>
           <w:p>
             <w:r>
-              <w:t>Prontuario</w:t>
+              <w:t>Prontuário</w:t>
             </w:r>
           </w:p>
         </w:tc>
@@ -605,7 +669,7 @@
           </w:tcPr>
           <w:p>
             <w:r>
-              <w:t>Registro clinico e termos assinados.</w:t>
+              <w:t>Registro clínico por cliente, anotações por sessão, termos assinados digitalmente.</w:t>
             </w:r>
           </w:p>
         </w:tc>
@@ -627,7 +691,7 @@
           </w:tcPr>
           <w:p>
             <w:r>
-              <w:t>RespostaNPS, TokenNPS</w:t>
+              <w:t>AvaliacaoNPS, RespostaNPS, TokenNPS</w:t>
             </w:r>
           </w:p>
         </w:tc>
@@ -637,7 +701,7 @@
           </w:tcPr>
           <w:p>
             <w:r>
-              <w:t>Pesquisa de satisfacao pos-atendimento com token 7 dias.</w:t>
+              <w:t>Pesquisa de satisfação pós-atendimento com token único de 7 dias.</w:t>
             </w:r>
           </w:p>
         </w:tc>
@@ -659,7 +723,7 @@
           </w:tcPr>
           <w:p>
             <w:r>
-              <w:t>Notificacao, LogAuditoria, TermoUso, Parametro</w:t>
+              <w:t>Notificacao, LogAuditoria, TermoUso, Parametro, ConfiguracaoSistema</w:t>
             </w:r>
           </w:p>
         </w:tc>
@@ -669,113 +733,75 @@
           </w:tcPr>
           <w:p>
             <w:r>
-              <w:t>Auditoria, notificacoes enviadas, termos versionados.</w:t>
+              <w:t>Auditoria imutável, notificações enviadas, termos versionados, parâmetros de configuração do sistema.</w:t>
             </w:r>
           </w:p>
         </w:tc>
       </w:tr>
     </w:tbl>
     <w:p>
-      <w:pPr>
-        <w:pStyle w:val="Heading1"/>
-      </w:pPr>
       <w:r>
-        <w:t>4. Autenticacao e Autorizacao</w:t>
+        <w:t>Soft-delete é aplicado a Cliente via campo deletado_em. Default manager (ClienteAtivosManager) oculta registros deletados; all_objects expõe histórico completo para auditoria.</w:t>
       </w:r>
     </w:p>
     <w:p>
       <w:r>
-        <w:t>Tres perfis distintos:</w:t>
+        <w:t>Constraints notáveis em Atendimento: status ∈ conjunto fixo (CheckConstraint), data_hora_fim &gt; data_hora_inicio. Índices compostos em (cliente, status), (profissional, data_hora_inicio), (tipo, canal, status_envio) otimizam queries críticas.</w:t>
       </w:r>
     </w:p>
     <w:p>
       <w:pPr>
-        <w:pStyle w:val="ListBullet"/>
+        <w:pStyle w:val="Heading1"/>
       </w:pPr>
       <w:r>
-        <w:t>Cliente anonimo: acessa agendamento publico sem login. Autenticacao via OTP por e-mail (codigo de 6 digitos, validade 10min, max 5 tentativas).</w:t>
-      </w:r>
-    </w:p>
-    <w:p>
-      <w:pPr>
-        <w:pStyle w:val="ListBullet"/>
-      </w:pPr>
-      <w:r>
-        <w:t>Profissional: login com senha hash. Acessa apenas sua agenda, marca atendimentos como realizados, adiciona anotacoes.</w:t>
-      </w:r>
-    </w:p>
-    <w:p>
-      <w:pPr>
-        <w:pStyle w:val="ListBullet"/>
-      </w:pPr>
-      <w:r>
-        <w:t>Admin: login com senha hash + django-axes (5 tentativas, lockout 1h). Acesso total ao painel.</w:t>
+        <w:t>4. Autenticação e Autorização</w:t>
       </w:r>
     </w:p>
     <w:p>
       <w:r>
-        <w:t>django-axes esta integrado com AxesStandaloneBackend e captura IP + username. Lockout por combinacao ip_address+username.</w:t>
+        <w:t>Três perfis distintos com fluxos de autenticação separados:</w:t>
       </w:r>
     </w:p>
     <w:p>
       <w:pPr>
-        <w:pStyle w:val="Heading1"/>
+        <w:pStyle w:val="ListBullet"/>
       </w:pPr>
       <w:r>
-        <w:t>5. Fluxo de Agendamento Publico</w:t>
+        <w:t>Cliente anônimo: acessa agendamento público sem login. Autenticação via OTP de 6 dígitos entregue por SMS (Zenvia), validade 10 minutos, máximo 5 tentativas. Gravada em OTPCode (email + hash do código + canal + telefone + IP). Renvio bloqueado por REENVIO_MINIMO_SEG.</w:t>
+      </w:r>
+    </w:p>
+    <w:p>
+      <w:pPr>
+        <w:pStyle w:val="ListBullet"/>
+      </w:pPr>
+      <w:r>
+        <w:t>Profissional: login com senha (hash pbkdf2_sha256). Acessa apenas a própria agenda, marca atendimentos como REALIZADO, registra anotações de sessão, aprova pedidos pendentes.</w:t>
+      </w:r>
+    </w:p>
+    <w:p>
+      <w:pPr>
+        <w:pStyle w:val="ListBullet"/>
+      </w:pPr>
+      <w:r>
+        <w:t>Admin: login com senha + django-axes (5 tentativas falhas → lockout 1h por combinação IP + username). Acesso total ao painel.</w:t>
       </w:r>
     </w:p>
     <w:p>
       <w:r>
-        <w:t>Fluxo de 6 etapas, cada uma renderizada na mesma pagina via JS:</w:t>
+        <w:t>AuthenticationBackends: AxesStandaloneBackend (primeiro — bloqueia antes de validar credencial) + ModelBackend padrão. Lockout cobre tanto tentativas válidas quanto inválidas.</w:t>
+      </w:r>
+    </w:p>
+    <w:p>
+      <w:pPr>
+        <w:pStyle w:val="Heading1"/>
+      </w:pPr>
+      <w:r>
+        <w:t>5. Comunicação Multi-Canal</w:t>
       </w:r>
     </w:p>
     <w:p>
       <w:r>
-        <w:t>1. Selecao de procedimento (filtro por categoria).</w:t>
-      </w:r>
-    </w:p>
-    <w:p>
-      <w:r>
-        <w:t>2. Selecao de profissional disponivel (opcional, default: qualquer).</w:t>
-      </w:r>
-    </w:p>
-    <w:p>
-      <w:r>
-        <w:t>3. Selecao de data + horario (API verifica slots + bloqueios + feriados).</w:t>
-      </w:r>
-    </w:p>
-    <w:p>
-      <w:r>
-        <w:t>4. Dados do cliente (nome, e-mail, telefone, data nascimento) + consents LGPD.</w:t>
-      </w:r>
-    </w:p>
-    <w:p>
-      <w:r>
-        <w:t>5. OTP: codigo enviado por e-mail, validado antes de confirmar.</w:t>
-      </w:r>
-    </w:p>
-    <w:p>
-      <w:r>
-        <w:t>6. Confirmacao: atomic transaction com SELECT FOR UPDATE no slot. E-mail de confirmacao enviado sincrono (2-3s, com spinner).</w:t>
-      </w:r>
-    </w:p>
-    <w:p>
-      <w:r>
-        <w:t>Turnstile (Cloudflare CAPTCHA) ativado no submit final. Rate limiting por IP em solicitar_otp, verificar_otp e confirmar_agendamento.</w:t>
-      </w:r>
-    </w:p>
-    <w:p>
-      <w:pPr>
-        <w:pStyle w:val="Heading1"/>
-      </w:pPr>
-      <w:r>
-        <w:t>6. Comunicacao Multi-Canal</w:t>
-      </w:r>
-    </w:p>
-    <w:p>
-      <w:r>
-        <w:t>Canais suportados, com envio condicionado a consent:</w:t>
+        <w:t>Regra corporativa vigente, centralizada em services/notificacao.py nas classes OTPService, EmailService e WhatsAppService:</w:t>
       </w:r>
     </w:p>
     <w:tbl>
@@ -806,7 +832,7 @@
           </w:tcPr>
           <w:p>
             <w:r>
-              <w:t>Uso</w:t>
+              <w:t>Uso exclusivo</w:t>
             </w:r>
           </w:p>
         </w:tc>
@@ -816,7 +842,7 @@
           </w:tcPr>
           <w:p>
             <w:r>
-              <w:t>Provedor</w:t>
+              <w:t>Consentimento exigido</w:t>
             </w:r>
           </w:p>
         </w:tc>
@@ -828,7 +854,7 @@
           </w:tcPr>
           <w:p>
             <w:r>
-              <w:t>E-mail</w:t>
+              <w:t>SMS (Zenvia)</w:t>
             </w:r>
           </w:p>
         </w:tc>
@@ -838,7 +864,7 @@
           </w:tcPr>
           <w:p>
             <w:r>
-              <w:t>OTP, confirmacao, lembrete, NPS, aniversario, promocoes, LGPD</w:t>
+              <w:t>OTP de autenticação para agendamento e portal.</w:t>
             </w:r>
           </w:p>
         </w:tc>
@@ -848,7 +874,7 @@
           </w:tcPr>
           <w:p>
             <w:r>
-              <w:t>SMTP (Gmail app password ou SendGrid)</w:t>
+              <w:t>Implícito (cliente fornece telefone = aceita receber o código).</w:t>
             </w:r>
           </w:p>
         </w:tc>
@@ -860,7 +886,7 @@
           </w:tcPr>
           <w:p>
             <w:r>
-              <w:t>WhatsApp</w:t>
+              <w:t>E-mail (SMTP)</w:t>
             </w:r>
           </w:p>
         </w:tc>
@@ -870,7 +896,7 @@
           </w:tcPr>
           <w:p>
             <w:r>
-              <w:t>Templates Meta Business (confirmacao D-1, NPS)</w:t>
+              <w:t>Promoções, campanhas de marketing, informações sobre pacotes de sessões, confirmações formais de compra, aniversário.</w:t>
             </w:r>
           </w:p>
         </w:tc>
@@ -880,7 +906,7 @@
           </w:tcPr>
           <w:p>
             <w:r>
-              <w:t>Meta WhatsApp Business API via webhook</w:t>
+              <w:t>consent_email_marketing para marketing/promoções/aniversário; transacional (pacote expirando/compra) não exige consent adicional.</w:t>
             </w:r>
           </w:p>
         </w:tc>
@@ -892,7 +918,7 @@
           </w:tcPr>
           <w:p>
             <w:r>
-              <w:t>SMS</w:t>
+              <w:t>WhatsApp (Meta)</w:t>
             </w:r>
           </w:p>
         </w:tc>
@@ -902,7 +928,7 @@
           </w:tcPr>
           <w:p>
             <w:r>
-              <w:t>OTP alternativo quando e-mail nao disponivel</w:t>
+              <w:t>Lembrete D-1 (24h antes do atendimento) e pesquisa NPS pós-atendimento.</w:t>
             </w:r>
           </w:p>
         </w:tc>
@@ -912,7 +938,7 @@
           </w:tcPr>
           <w:p>
             <w:r>
-              <w:t>Zenvia (autenticacao API + webhook HMAC IP-allowlist)</w:t>
+              <w:t>consent_whatsapp_confirmacao para D-1; consent_whatsapp_nps para NPS.</w:t>
             </w:r>
           </w:p>
         </w:tc>
@@ -920,300 +946,946 @@
     </w:tbl>
     <w:p>
       <w:r>
-        <w:t>O cliente possui campos de consent granulares: aceita_cadastro, consent_email_marketing, consent_email_nps, consent_whatsapp_confirmacao, consent_whatsapp_nps, consent_sms_otp. Capturados no agendamento publico.</w:t>
-      </w:r>
-    </w:p>
-    <w:p>
-      <w:pPr>
-        <w:pStyle w:val="Heading1"/>
-      </w:pPr>
-      <w:r>
-        <w:t>7. Seguranca</w:t>
-      </w:r>
-    </w:p>
-    <w:p>
-      <w:pPr>
-        <w:pStyle w:val="ListBullet"/>
-      </w:pPr>
-      <w:r>
-        <w:t>CSP com nonce por request (middleware proprio). Bloqueia XSS.</w:t>
-      </w:r>
-    </w:p>
-    <w:p>
-      <w:pPr>
-        <w:pStyle w:val="ListBullet"/>
-      </w:pPr>
-      <w:r>
-        <w:t>SecurityHeadersMiddleware: HSTS, X-Frame-Options DENY, Referrer-Policy, X-Content-Type-Options, Permissions-Policy.</w:t>
-      </w:r>
-    </w:p>
-    <w:p>
-      <w:pPr>
-        <w:pStyle w:val="ListBullet"/>
-      </w:pPr>
-      <w:r>
-        <w:t>CSRF: tokens em todos os forms. SAMESITE=Lax.</w:t>
-      </w:r>
-    </w:p>
-    <w:p>
-      <w:pPr>
-        <w:pStyle w:val="ListBullet"/>
-      </w:pPr>
-      <w:r>
-        <w:t>HTTPS forcado em producao com SECURE_SSL_REDIRECT + HSTS 1 ano + preload.</w:t>
-      </w:r>
-    </w:p>
-    <w:p>
-      <w:pPr>
-        <w:pStyle w:val="ListBullet"/>
-      </w:pPr>
-      <w:r>
-        <w:t>Healthchecks excluidos do redirect para probe do Railway funcionar.</w:t>
-      </w:r>
-    </w:p>
-    <w:p>
-      <w:pPr>
-        <w:pStyle w:val="ListBullet"/>
-      </w:pPr>
-      <w:r>
-        <w:t>django-axes: brute-force login lockout.</w:t>
-      </w:r>
-    </w:p>
-    <w:p>
-      <w:pPr>
-        <w:pStyle w:val="ListBullet"/>
-      </w:pPr>
-      <w:r>
-        <w:t>Rate limiting: OTP (IP + cliente), agendamento (IP), webhooks (token + HMAC + IP-allowlist).</w:t>
-      </w:r>
-    </w:p>
-    <w:p>
-      <w:pPr>
-        <w:pStyle w:val="ListBullet"/>
-      </w:pPr>
-      <w:r>
-        <w:t>Senhas: hash padrao Django (pbkdf2_sha256).</w:t>
-      </w:r>
-    </w:p>
-    <w:p>
-      <w:pPr>
-        <w:pStyle w:val="ListBullet"/>
-      </w:pPr>
-      <w:r>
-        <w:t>Zenvia webhook: IP-allowlist + HMAC do payload.</w:t>
-      </w:r>
-    </w:p>
-    <w:p>
-      <w:pPr>
-        <w:pStyle w:val="ListBullet"/>
-      </w:pPr>
-      <w:r>
-        <w:t>Cron endpoint: header X-Cron-Token validado com hmac.compare_digest.</w:t>
-      </w:r>
-    </w:p>
-    <w:p>
-      <w:pPr>
-        <w:pStyle w:val="ListBullet"/>
-      </w:pPr>
-      <w:r>
-        <w:t>PII masking em logs (LogAuditoria grava hash de e-mail/telefone).</w:t>
-      </w:r>
-    </w:p>
-    <w:p>
-      <w:pPr>
-        <w:pStyle w:val="ListBullet"/>
-      </w:pPr>
-      <w:r>
-        <w:t>Secrets via env vars, nunca em commit. Baseline de secrets removida junto com dev tooling.</w:t>
-      </w:r>
-    </w:p>
-    <w:p>
-      <w:pPr>
-        <w:pStyle w:val="Heading1"/>
-      </w:pPr>
-      <w:r>
-        <w:t>8. LGPD e Compliance</w:t>
-      </w:r>
-    </w:p>
-    <w:p>
-      <w:pPr>
-        <w:pStyle w:val="ListBullet"/>
-      </w:pPr>
-      <w:r>
-        <w:t>Consent granular por canal no cliente, capturado no agendamento.</w:t>
-      </w:r>
-    </w:p>
-    <w:p>
-      <w:pPr>
-        <w:pStyle w:val="ListBullet"/>
-      </w:pPr>
-      <w:r>
-        <w:t>DSAR: /lgpd/meus-dados/ expoe todos os dados do cliente em JSON + HTML, autenticado via OTP.</w:t>
-      </w:r>
-    </w:p>
-    <w:p>
-      <w:pPr>
-        <w:pStyle w:val="ListBullet"/>
-      </w:pPr>
-      <w:r>
-        <w:t>Opt-out one-click: List-Unsubscribe header RFC 8058 em todos os e-mails marketing.</w:t>
-      </w:r>
-    </w:p>
-    <w:p>
-      <w:pPr>
-        <w:pStyle w:val="ListBullet"/>
-      </w:pPr>
-      <w:r>
-        <w:t>Retencao: job lgpd_purgar_inativos apaga clientes sem atendimento ha mais de 5 anos (semanalmente, domingo 03:00).</w:t>
-      </w:r>
-    </w:p>
-    <w:p>
-      <w:pPr>
-        <w:pStyle w:val="ListBullet"/>
-      </w:pPr>
-      <w:r>
-        <w:t>Auditoria: LogAuditoria grava toda alteracao sensivel (acesso prontuario, exportacao relatorio, alteracao consent).</w:t>
-      </w:r>
-    </w:p>
-    <w:p>
-      <w:pPr>
-        <w:pStyle w:val="ListBullet"/>
-      </w:pPr>
-      <w:r>
-        <w:t>Termos: TermoUso versionado, assinatura digital do cliente armazenada.</w:t>
-      </w:r>
-    </w:p>
-    <w:p>
-      <w:pPr>
-        <w:pStyle w:val="ListBullet"/>
-      </w:pPr>
-      <w:r>
-        <w:t>DPIA documentado em docs/DPIA.md.</w:t>
-      </w:r>
-    </w:p>
-    <w:p>
-      <w:pPr>
-        <w:pStyle w:val="Heading1"/>
-      </w:pPr>
-      <w:r>
-        <w:t>9. Integracoes Externas</w:t>
-      </w:r>
-    </w:p>
-    <w:p>
-      <w:pPr>
-        <w:pStyle w:val="ListBullet"/>
-      </w:pPr>
-      <w:r>
-        <w:t>SMTP (Gmail ou SendGrid): envio transacional.</w:t>
-      </w:r>
-    </w:p>
-    <w:p>
-      <w:pPr>
-        <w:pStyle w:val="ListBullet"/>
-      </w:pPr>
-      <w:r>
-        <w:t>Meta WhatsApp Business API: webhook + templates.</w:t>
-      </w:r>
-    </w:p>
-    <w:p>
-      <w:pPr>
-        <w:pStyle w:val="ListBullet"/>
-      </w:pPr>
-      <w:r>
-        <w:t>Zenvia: SMS OTP com webhook de delivery.</w:t>
-      </w:r>
-    </w:p>
-    <w:p>
-      <w:pPr>
-        <w:pStyle w:val="ListBullet"/>
-      </w:pPr>
-      <w:r>
-        <w:t>Cloudflare Turnstile: CAPTCHA invisivel no agendamento.</w:t>
-      </w:r>
-    </w:p>
-    <w:p>
-      <w:pPr>
-        <w:pStyle w:val="ListBullet"/>
-      </w:pPr>
-      <w:r>
-        <w:t>Sentry (opcional): tracing e error reporting quando SENTRY_DSN setado.</w:t>
-      </w:r>
-    </w:p>
-    <w:p>
-      <w:pPr>
-        <w:pStyle w:val="ListBullet"/>
-      </w:pPr>
-      <w:r>
-        <w:t>cron-job.org (externo, gratuito): substitui Celery Beat. Chama /cron/run/&lt;job&gt;/ com X-Cron-Token.</w:t>
-      </w:r>
-    </w:p>
-    <w:p>
-      <w:pPr>
-        <w:pStyle w:val="Heading1"/>
-      </w:pPr>
-      <w:r>
-        <w:t>10. Observabilidade</w:t>
-      </w:r>
-    </w:p>
-    <w:p>
-      <w:pPr>
-        <w:pStyle w:val="ListBullet"/>
-      </w:pPr>
-      <w:r>
-        <w:t>/healthz/: liveness, retorna 200 se processo vivo.</w:t>
-      </w:r>
-    </w:p>
-    <w:p>
-      <w:pPr>
-        <w:pStyle w:val="ListBullet"/>
-      </w:pPr>
-      <w:r>
-        <w:t>/health/: readiness, checa DB + cache. Retorna 503 se degradado. ?celery=1 forca check adicional de broker.</w:t>
-      </w:r>
-    </w:p>
-    <w:p>
-      <w:pPr>
-        <w:pStyle w:val="ListBullet"/>
-      </w:pPr>
-      <w:r>
-        <w:t>Logging estruturado JSON em producao (python-json-logger).</w:t>
-      </w:r>
-    </w:p>
-    <w:p>
-      <w:pPr>
-        <w:pStyle w:val="ListBullet"/>
-      </w:pPr>
-      <w:r>
-        <w:t>Nivel: WARNING root, INFO django. app_shivazen em INFO.</w:t>
-      </w:r>
-    </w:p>
-    <w:p>
-      <w:pPr>
-        <w:pStyle w:val="ListBullet"/>
-      </w:pPr>
-      <w:r>
-        <w:t>Sentry: opt-in via SENTRY_DSN. SendDefaultPII desativado.</w:t>
-      </w:r>
-    </w:p>
-    <w:p>
-      <w:pPr>
-        <w:pStyle w:val="ListBullet"/>
-      </w:pPr>
-      <w:r>
-        <w:t>LogAuditoria (DB): trilha operacoes sensiveis, imutavel apos escrita.</w:t>
-      </w:r>
-    </w:p>
-    <w:p>
-      <w:pPr>
-        <w:pStyle w:val="Heading1"/>
-      </w:pPr>
-      <w:r>
-        <w:t>11. Infraestrutura e Deploy</w:t>
+        <w:t>Cada disparo verifica o consentimento antes de chamar o provedor. Tentativas bloqueadas por falta de consent são registradas em log com nível INFO (não disparam erro).</w:t>
       </w:r>
     </w:p>
     <w:p>
       <w:r>
-        <w:t>Configuracao corrente no Railway free tier:</w:t>
+        <w:t>Endpoints de substituição ao Celery Beat (cron externo):</w:t>
+      </w:r>
+    </w:p>
+    <w:p>
+      <w:pPr>
+        <w:pStyle w:val="ListBullet"/>
+      </w:pPr>
+      <w:r>
+        <w:t>POST /cron/run/lembrete_diario/ — envia lembretes D-1 via WhatsApp.</w:t>
+      </w:r>
+    </w:p>
+    <w:p>
+      <w:pPr>
+        <w:pStyle w:val="ListBullet"/>
+      </w:pPr>
+      <w:r>
+        <w:t>POST /cron/run/nps_24h/ — envia pesquisa NPS 24h após REALIZADO.</w:t>
+      </w:r>
+    </w:p>
+    <w:p>
+      <w:pPr>
+        <w:pStyle w:val="ListBullet"/>
+      </w:pPr>
+      <w:r>
+        <w:t>POST /cron/run/detrator_alerta/ — alerta admin sobre nota ≤ 6.</w:t>
+      </w:r>
+    </w:p>
+    <w:p>
+      <w:pPr>
+        <w:pStyle w:val="ListBullet"/>
+      </w:pPr>
+      <w:r>
+        <w:t>POST /cron/run/pacote_expirando/ — aviso de pacote próximo do vencimento.</w:t>
+      </w:r>
+    </w:p>
+    <w:p>
+      <w:pPr>
+        <w:pStyle w:val="ListBullet"/>
+      </w:pPr>
+      <w:r>
+        <w:t>POST /cron/run/pacote_expirar/ — marca pacotes vencidos como EXPIRADO.</w:t>
+      </w:r>
+    </w:p>
+    <w:p>
+      <w:pPr>
+        <w:pStyle w:val="ListBullet"/>
+      </w:pPr>
+      <w:r>
+        <w:t>POST /cron/run/aniversario/ — e-mail de aniversário.</w:t>
+      </w:r>
+    </w:p>
+    <w:p>
+      <w:pPr>
+        <w:pStyle w:val="ListBullet"/>
+      </w:pPr>
+      <w:r>
+        <w:t>POST /cron/run/limpeza_status/ — marca FALTOU em atendimentos não atualizados.</w:t>
+      </w:r>
+    </w:p>
+    <w:p>
+      <w:pPr>
+        <w:pStyle w:val="ListBullet"/>
+      </w:pPr>
+      <w:r>
+        <w:t>POST /cron/run/lgpd_purgar/ — anonimiza clientes inativos (2 anos).</w:t>
+      </w:r>
+    </w:p>
+    <w:p>
+      <w:r>
+        <w:t>Autenticação: header X-Cron-Token comparado com hmac.compare_digest contra env var CRON_TOKEN.</w:t>
+      </w:r>
+    </w:p>
+    <w:p>
+      <w:pPr>
+        <w:pStyle w:val="Heading1"/>
+      </w:pPr>
+      <w:r>
+        <w:t>6. Regras de Negócio — Agendamento Público</w:t>
+      </w:r>
+    </w:p>
+    <w:p>
+      <w:r>
+        <w:t>Fluxo de 6 etapas renderizadas na mesma página (booking-form) via JS controlando step-panels. URL: /agendamento/. View principal: views.booking.agendamento_publico + confirmar_agendamento.</w:t>
+      </w:r>
+    </w:p>
+    <w:p>
+      <w:r>
+        <w:t>1. Seleção de procedimento: grid filtrável por categoria. Só procedimentos com disponibilidade configurada aparecem.</w:t>
+      </w:r>
+    </w:p>
+    <w:p>
+      <w:r>
+        <w:t>2. Seleção de profissional: opcional (default: qualquer disponível). Se selecionado, restringe slots aos profissionais do procedimento.</w:t>
+      </w:r>
+    </w:p>
+    <w:p>
+      <w:r>
+        <w:t>3. Seleção de data/horário: API GET /api/dias-disponiveis/ retorna calendário; GET /api/horarios-disponiveis/ retorna slots livres. Considera JornadaTrabalho do profissional, bloqueios, feriados BR (carregados por management command carregar_feriados) e duração do procedimento. Não mostra horários no passado.</w:t>
+      </w:r>
+    </w:p>
+    <w:p>
+      <w:r>
+        <w:t>4. Dados do cliente: nome, e-mail obrigatório, telefone obrigatório (exigido para OTP), data de nascimento opcional, checkboxes LGPD (email marketing, WhatsApp D-1 default marcado, WhatsApp NPS).</w:t>
+      </w:r>
+    </w:p>
+    <w:p>
+      <w:r>
+        <w:t>5. OTP: POST /agendamento/otp/solicitar/ dispara SMS Zenvia (rate limit 5/min por IP). Código 6 dígitos, validade 10min, máximo 5 tentativas. Sem fallback e-mail — se telefone inválido, fluxo aborta. POST /agendamento/otp/verificar/ valida (rate limit 10/min por IP). Aprovação do OTP persiste na sessão (otp_agendamento_email).</w:t>
+      </w:r>
+    </w:p>
+    <w:p>
+      <w:r>
+        <w:t>6. Confirmação: POST /agendamento/confirmar/ dentro de transaction.atomic com SELECT FOR UPDATE no slot. Cloudflare Turnstile valida o token se TURNSTILE_ENABLED. Checa colisão de horário via AgendamentoService.criar (existe-conflito entre data_hora_inicio e data_hora_fim no status AGENDADO/PENDENTE/CONFIRMADO do profissional). Cria cliente se inexistente (select_for_update + get_or_create) ou atualiza campos pendentes. Registra Atendimento com status PENDENTE. Grava consents com timestamp e IP. Gera token_cancelamento único.</w:t>
+      </w:r>
+    </w:p>
+    <w:p>
+      <w:r>
+        <w:t>Regras críticas:</w:t>
+      </w:r>
+    </w:p>
+    <w:p>
+      <w:pPr>
+        <w:pStyle w:val="ListBullet"/>
+      </w:pPr>
+      <w:r>
+        <w:t>OTP requer telefone — sem telefone, solicitação retorna telefone_ausente. Para cliente existente, telefone cadastrado tem prioridade sobre o digitado no form.</w:t>
+      </w:r>
+    </w:p>
+    <w:p>
+      <w:pPr>
+        <w:pStyle w:val="ListBullet"/>
+      </w:pPr>
+      <w:r>
+        <w:t>Rate limits: 5 solicitações de OTP/minuto por IP; 10 verificações/minuto; 3 SMS/hora por telefone; 10 SMS/hora por IP; 60 SMS/hora global.</w:t>
+      </w:r>
+    </w:p>
+    <w:p>
+      <w:pPr>
+        <w:pStyle w:val="ListBullet"/>
+      </w:pPr>
+      <w:r>
+        <w:t>Cliente com bloqueado_online=True não consegue agendar online. Bloqueio automático após 3 faltas consecutivas.</w:t>
+      </w:r>
+    </w:p>
+    <w:p>
+      <w:pPr>
+        <w:pStyle w:val="ListBullet"/>
+      </w:pPr>
+      <w:r>
+        <w:t>Após o confirmar, tela de sucesso (agendamento_sucesso.html) mostra link para "Meus Agendamentos" — não há e-mail de confirmação.</w:t>
+      </w:r>
+    </w:p>
+    <w:p>
+      <w:pPr>
+        <w:pStyle w:val="ListBullet"/>
+      </w:pPr>
+      <w:r>
+        <w:t>Lembrete D-1 por WhatsApp (se consent) sai automaticamente via cron às 08:00 no dia anterior, para atendimentos com status AGENDADO.</w:t>
+      </w:r>
+    </w:p>
+    <w:p>
+      <w:pPr>
+        <w:pStyle w:val="Heading1"/>
+      </w:pPr>
+      <w:r>
+        <w:t>7. Regras de Negócio — Portal do Cliente</w:t>
+      </w:r>
+    </w:p>
+    <w:p>
+      <w:r>
+        <w:t>URL: /meus-agendamentos/. Views: booking.meus_agendamentos + fluxo OTP próprio.</w:t>
+      </w:r>
+    </w:p>
+    <w:p>
+      <w:pPr>
+        <w:pStyle w:val="ListBullet"/>
+      </w:pPr>
+      <w:r>
+        <w:t>Acesso via OTP por SMS (não requer senha). Cliente informa e-mail, sistema envia código ao telefone cadastrado, cliente valida.</w:t>
+      </w:r>
+    </w:p>
+    <w:p>
+      <w:pPr>
+        <w:pStyle w:val="ListBullet"/>
+      </w:pPr>
+      <w:r>
+        <w:t>Lista atendimentos futuros e histórico recente com AgendamentoService.ativos_no_futuro_do_cliente (select_related + order_by data_hora_inicio).</w:t>
+      </w:r>
+    </w:p>
+    <w:p>
+      <w:pPr>
+        <w:pStyle w:val="ListBullet"/>
+      </w:pPr>
+      <w:r>
+        <w:t>Cancelamento: POST /meus-agendamentos/cancelar/&lt;id&gt;/ — só permitido se status ∈ {PENDENTE, AGENDADO, CONFIRMADO} e data futura. Atualiza status para CANCELADO, registra auditoria.</w:t>
+      </w:r>
+    </w:p>
+    <w:p>
+      <w:pPr>
+        <w:pStyle w:val="ListBullet"/>
+      </w:pPr>
+      <w:r>
+        <w:t>Reagendamento: /reagendar/&lt;token&gt;/ usa token_cancelamento do Atendimento. View GET mostra calendário; POST cria novo Atendimento com reagendado_de=atendimento_original e marca original como REAGENDADO.</w:t>
+      </w:r>
+    </w:p>
+    <w:p>
+      <w:pPr>
+        <w:pStyle w:val="ListBullet"/>
+      </w:pPr>
+      <w:r>
+        <w:t>Logout via POST /meus-agendamentos/logout/ limpa sessão.</w:t>
+      </w:r>
+    </w:p>
+    <w:p>
+      <w:pPr>
+        <w:pStyle w:val="ListBullet"/>
+      </w:pPr>
+      <w:r>
+        <w:t>Confirmação de presença: link em e-mail D-1 (se canal ativo). Endpoint /confirmar-presenca/&lt;token&gt;/ aceita confirmar ou cancelar.</w:t>
+      </w:r>
+    </w:p>
+    <w:p>
+      <w:pPr>
+        <w:pStyle w:val="Heading1"/>
+      </w:pPr>
+      <w:r>
+        <w:t>8. Regras de Negócio — Portal do Profissional</w:t>
+      </w:r>
+    </w:p>
+    <w:p>
+      <w:r>
+        <w:t>URL: /profissional/. Requer autenticação com senha.</w:t>
+      </w:r>
+    </w:p>
+    <w:p>
+      <w:pPr>
+        <w:pStyle w:val="ListBullet"/>
+      </w:pPr>
+      <w:r>
+        <w:t>Agenda diária/semanal visível apenas para o profissional logado.</w:t>
+      </w:r>
+    </w:p>
+    <w:p>
+      <w:pPr>
+        <w:pStyle w:val="ListBullet"/>
+      </w:pPr>
+      <w:r>
+        <w:t>Aprovar/rejeitar atendimento com status PENDENTE: muda para AGENDADO ou CANCELADO. Dispara e-mail de confirmação ao cliente (enviar_confirmacao_agendamento_email) e alerta admin se rejeição.</w:t>
+      </w:r>
+    </w:p>
+    <w:p>
+      <w:pPr>
+        <w:pStyle w:val="ListBullet"/>
+      </w:pPr>
+      <w:r>
+        <w:t>Marcar como REALIZADO: POST /profissional/atendimento/&lt;id&gt;/realizado/. Dispara PacoteService.debitar_sessao_por_atendimento (se aplicável). Permite entrada de valor_cobrado diferente do tabelado.</w:t>
+      </w:r>
+    </w:p>
+    <w:p>
+      <w:pPr>
+        <w:pStyle w:val="ListBullet"/>
+      </w:pPr>
+      <w:r>
+        <w:t>Anotações de sessão: formulário próprio, salva em AnotacaoSessao vinculado ao atendimento. Dados sensíveis — registrados em LogAuditoria.</w:t>
+      </w:r>
+    </w:p>
+    <w:p>
+      <w:pPr>
+        <w:pStyle w:val="ListBullet"/>
+      </w:pPr>
+      <w:r>
+        <w:t>Nenhuma ação retroativa em atendimentos REALIZADOS (exceto anotação).</w:t>
+      </w:r>
+    </w:p>
+    <w:p>
+      <w:pPr>
+        <w:pStyle w:val="Heading1"/>
+      </w:pPr>
+      <w:r>
+        <w:t>9. Regras de Negócio — Painel Administrativo</w:t>
+      </w:r>
+    </w:p>
+    <w:p>
+      <w:r>
+        <w:t>URL: /painel/. Requer autenticação com perfil Administrador.</w:t>
+      </w:r>
+    </w:p>
+    <w:p>
+      <w:pPr>
+        <w:pStyle w:val="ListBullet"/>
+      </w:pPr>
+      <w:r>
+        <w:t>Overview: dashboard com KPIs (agendamentos do dia, faturamento mensal, taxa de comparecimento, NPS médio).</w:t>
+      </w:r>
+    </w:p>
+    <w:p>
+      <w:pPr>
+        <w:pStyle w:val="ListBullet"/>
+      </w:pPr>
+      <w:r>
+        <w:t>Agendamentos: CRUD completo. Admin pode criar/editar/cancelar qualquer atendimento, mesmo no passado.</w:t>
+      </w:r>
+    </w:p>
+    <w:p>
+      <w:pPr>
+        <w:pStyle w:val="ListBullet"/>
+      </w:pPr>
+      <w:r>
+        <w:t>Clientes: lista + detalhe. Ver consentimentos ativos, histórico de atendimentos, avaliações NPS. Bloquear/desbloquear online.</w:t>
+      </w:r>
+    </w:p>
+    <w:p>
+      <w:pPr>
+        <w:pStyle w:val="ListBullet"/>
+      </w:pPr>
+      <w:r>
+        <w:t>Profissionais: cadastro + edição. Define jornada (dias/horários de trabalho), procedimentos que atende, status (ATIVO/INATIVO).</w:t>
+      </w:r>
+    </w:p>
+    <w:p>
+      <w:pPr>
+        <w:pStyle w:val="ListBullet"/>
+      </w:pPr>
+      <w:r>
+        <w:t>Procedimentos: CRUD + categoria. Define duração, preço, imagem.</w:t>
+      </w:r>
+    </w:p>
+    <w:p>
+      <w:pPr>
+        <w:pStyle w:val="ListBullet"/>
+      </w:pPr>
+      <w:r>
+        <w:t>Pacotes: CRUD + venda. Composto por itens (procedimento + quantidade de sessões). Admin registra venda em PacoteCliente.</w:t>
+      </w:r>
+    </w:p>
+    <w:p>
+      <w:pPr>
+        <w:pStyle w:val="ListBullet"/>
+      </w:pPr>
+      <w:r>
+        <w:t>Promoções: CRUD + disparo de e-mail. Campanha valida consent_email_marketing por destinatário.</w:t>
+      </w:r>
+    </w:p>
+    <w:p>
+      <w:pPr>
+        <w:pStyle w:val="ListBullet"/>
+      </w:pPr>
+      <w:r>
+        <w:t>Bloqueios de agenda: admin registra período de indisponibilidade (férias, evento) por profissional.</w:t>
+      </w:r>
+    </w:p>
+    <w:p>
+      <w:pPr>
+        <w:pStyle w:val="ListBullet"/>
+      </w:pPr>
+      <w:r>
+        <w:t>Lista de espera: visualiza inscritos, notifica quando houver disponibilidade.</w:t>
+      </w:r>
+    </w:p>
+    <w:p>
+      <w:pPr>
+        <w:pStyle w:val="ListBullet"/>
+      </w:pPr>
+      <w:r>
+        <w:t>Auditoria: /painel/auditoria/ consulta LogAuditoria com filtros por operação, usuário, data.</w:t>
+      </w:r>
+    </w:p>
+    <w:p>
+      <w:pPr>
+        <w:pStyle w:val="ListBullet"/>
+      </w:pPr>
+      <w:r>
+        <w:t>Termos: gerencia versões de TermoUso; exibe assinaturas pendentes.</w:t>
+      </w:r>
+    </w:p>
+    <w:p>
+      <w:pPr>
+        <w:pStyle w:val="ListBullet"/>
+      </w:pPr>
+      <w:r>
+        <w:t>Prontuário: acessa registros clínicos com auditoria obrigatória (Consentimento explícito antes de ver dados sensíveis).</w:t>
+      </w:r>
+    </w:p>
+    <w:p>
+      <w:pPr>
+        <w:pStyle w:val="ListBullet"/>
+      </w:pPr>
+      <w:r>
+        <w:t>Relatórios: exporta Excel (xlsx) com agendamentos/faturamento por período. View exportar_relatorio_excel.</w:t>
+      </w:r>
+    </w:p>
+    <w:p>
+      <w:pPr>
+        <w:pStyle w:val="ListBullet"/>
+      </w:pPr>
+      <w:r>
+        <w:t>Preview de e-mail: renderiza template com dados de exemplo antes de disparar campanha.</w:t>
+      </w:r>
+    </w:p>
+    <w:p>
+      <w:pPr>
+        <w:pStyle w:val="Heading1"/>
+      </w:pPr>
+      <w:r>
+        <w:t>10. Regras de Negócio — Pacotes de Sessões</w:t>
+      </w:r>
+    </w:p>
+    <w:p>
+      <w:r>
+        <w:t>Pacote é uma coleção de ItemPacote (procedimento + quantidade). Cliente compra via PacoteCliente, que tem status ATIVO/EXPIRADO/FINALIZADO.</w:t>
+      </w:r>
+    </w:p>
+    <w:p>
+      <w:pPr>
+        <w:pStyle w:val="ListBullet"/>
+      </w:pPr>
+      <w:r>
+        <w:t>Compra: admin registra PacoteCliente.criar (status=ATIVO, data_expiracao = data_compra + validade_dias do Pacote).</w:t>
+      </w:r>
+    </w:p>
+    <w:p>
+      <w:pPr>
+        <w:pStyle w:val="ListBullet"/>
+      </w:pPr>
+      <w:r>
+        <w:t>Consumo: quando atendimento é marcado como REALIZADO, PacoteService.debitar_sessao_por_atendimento procura o primeiro PacoteCliente ATIVO do cliente que tenha ItemPacote cobrindo o procedimento e ainda possua saldo de sessões (sessoes_ja_feitas &lt; quantidade_sessoes). Cria SessaoPacote.</w:t>
+      </w:r>
+    </w:p>
+    <w:p>
+      <w:pPr>
+        <w:pStyle w:val="ListBullet"/>
+      </w:pPr>
+      <w:r>
+        <w:t>Finalização: se todas as sessões foram consumidas, PacoteCliente.verificar_finalizacao marca status=FINALIZADO.</w:t>
+      </w:r>
+    </w:p>
+    <w:p>
+      <w:pPr>
+        <w:pStyle w:val="ListBullet"/>
+      </w:pPr>
+      <w:r>
+        <w:t>Expiração: job pacote_expirar (cron diário 00:30) percorre PacoteCliente ATIVOS com data_expiracao &lt; hoje e marca status=EXPIRADO.</w:t>
+      </w:r>
+    </w:p>
+    <w:p>
+      <w:pPr>
+        <w:pStyle w:val="ListBullet"/>
+      </w:pPr>
+      <w:r>
+        <w:t>Aviso prévio: job pacote_expirando (cron diário 07:00) envia e-mail 7 dias antes da expiração (transacional, não exige consent).</w:t>
+      </w:r>
+    </w:p>
+    <w:p>
+      <w:pPr>
+        <w:pStyle w:val="ListBullet"/>
+      </w:pPr>
+      <w:r>
+        <w:t>Ordenação: pacote mais antigo é consumido primeiro (order_by criado_em).</w:t>
+      </w:r>
+    </w:p>
+    <w:p>
+      <w:pPr>
+        <w:pStyle w:val="Heading1"/>
+      </w:pPr>
+      <w:r>
+        <w:t>11. Regras de Negócio — NPS e Satisfação</w:t>
+      </w:r>
+    </w:p>
+    <w:p>
+      <w:pPr>
+        <w:pStyle w:val="ListBullet"/>
+      </w:pPr>
+      <w:r>
+        <w:t>Disparo: job nps_24h (cron diário 10:00) seleciona atendimentos com status=REALIZADO, data_hora_fim ≤ agora-1dia, sem AvaliacaoNPS vinculada, com consent_whatsapp_nps=True.</w:t>
+      </w:r>
+    </w:p>
+    <w:p>
+      <w:pPr>
+        <w:pStyle w:val="ListBullet"/>
+      </w:pPr>
+      <w:r>
+        <w:t>Canal: WhatsApp Meta exclusivo. Gera token (secrets.token_urlsafe(32)) e link /nps/&lt;token&gt;/. Mensagem via template Meta aprovado.</w:t>
+      </w:r>
+    </w:p>
+    <w:p>
+      <w:pPr>
+        <w:pStyle w:val="ListBullet"/>
+      </w:pPr>
+      <w:r>
+        <w:t>Expiração do token: 7 dias após envio. Link expirado mostra aviso.</w:t>
+      </w:r>
+    </w:p>
+    <w:p>
+      <w:pPr>
+        <w:pStyle w:val="ListBullet"/>
+      </w:pPr>
+      <w:r>
+        <w:t>Resposta: página pública mostra escala 0-10 + campo comentário. Salva AvaliacaoNPS com nota e comentário.</w:t>
+      </w:r>
+    </w:p>
+    <w:p>
+      <w:pPr>
+        <w:pStyle w:val="ListBullet"/>
+      </w:pPr>
+      <w:r>
+        <w:t>Categorização: nota 0-6 = detrator; 7-8 = neutro; 9-10 = promotor.</w:t>
+      </w:r>
+    </w:p>
+    <w:p>
+      <w:pPr>
+        <w:pStyle w:val="ListBullet"/>
+      </w:pPr>
+      <w:r>
+        <w:t>Alerta admin detrator: job detrator_alerta (cron diário 10:30) envia e-mail ao email_admin para cada avaliação detratora com alerta_enviado=False, depois marca como enviado (idempotência).</w:t>
+      </w:r>
+    </w:p>
+    <w:p>
+      <w:pPr>
+        <w:pStyle w:val="ListBullet"/>
+      </w:pPr>
+      <w:r>
+        <w:t>Sem consent: NPS é ignorado para o cliente; não há fallback via e-mail por padrão.</w:t>
+      </w:r>
+    </w:p>
+    <w:p>
+      <w:pPr>
+        <w:pStyle w:val="Heading1"/>
+      </w:pPr>
+      <w:r>
+        <w:t>12. Regras de Negócio — Marketing e Promoções</w:t>
+      </w:r>
+    </w:p>
+    <w:p>
+      <w:pPr>
+        <w:pStyle w:val="ListBullet"/>
+      </w:pPr>
+      <w:r>
+        <w:t>Cadastro: admin cria Promocao (título, corpo HTML, cupom opcional, validade em dias). Preview disponível.</w:t>
+      </w:r>
+    </w:p>
+    <w:p>
+      <w:pPr>
+        <w:pStyle w:val="ListBullet"/>
+      </w:pPr>
+      <w:r>
+        <w:t>Disparo: admin clica em "Enviar" — sistema percorre Clientes com consent_email_marketing=True e e-mail preenchido. Para cada um, chama EmailService.enviar_promocao passando o token de unsubscribe.</w:t>
+      </w:r>
+    </w:p>
+    <w:p>
+      <w:pPr>
+        <w:pStyle w:val="ListBullet"/>
+      </w:pPr>
+      <w:r>
+        <w:t>Campanha registrada em Notificacao (canal=EMAIL, tipo=CONFIRMACAO ou criado específico para promoção).</w:t>
+      </w:r>
+    </w:p>
+    <w:p>
+      <w:pPr>
+        <w:pStyle w:val="ListBullet"/>
+      </w:pPr>
+      <w:r>
+        <w:t>Opt-out one-click: cabeçalho RFC 8058 List-Unsubscribe + link no footer do e-mail. GET /lgpd/unsubscribe/&lt;token&gt;/ marca consent_email_marketing=False, consent_whatsapp_nps=False e aceita_comunicacao=False.</w:t>
+      </w:r>
+    </w:p>
+    <w:p>
+      <w:pPr>
+        <w:pStyle w:val="ListBullet"/>
+      </w:pPr>
+      <w:r>
+        <w:t>Aniversário: job aniversario (cron diário 09:00) percorre clientes com aniversário no dia + consent_email_marketing, envia EmailService.enviar_aniversario.</w:t>
+      </w:r>
+    </w:p>
+    <w:p>
+      <w:pPr>
+        <w:pStyle w:val="Heading1"/>
+      </w:pPr>
+      <w:r>
+        <w:t>13. Regras de Negócio — Lista de Espera</w:t>
+      </w:r>
+    </w:p>
+    <w:p>
+      <w:pPr>
+        <w:pStyle w:val="ListBullet"/>
+      </w:pPr>
+      <w:r>
+        <w:t>Inscrição: /lista-espera/ formulário público. Cliente informa nome, e-mail, telefone, procedimento de interesse, data-alvo aproximada.</w:t>
+      </w:r>
+    </w:p>
+    <w:p>
+      <w:pPr>
+        <w:pStyle w:val="ListBullet"/>
+      </w:pPr>
+      <w:r>
+        <w:t>Cria ListaEspera com status AGUARDANDO.</w:t>
+      </w:r>
+    </w:p>
+    <w:p>
+      <w:pPr>
+        <w:pStyle w:val="ListBullet"/>
+      </w:pPr>
+      <w:r>
+        <w:t>Notificação: quando admin cria um bloqueio que libera horários, ou quando há cancelamento, admin pode acionar notificação manual via painel. Task job_notificar_fila_espera (sem disparo agendado) envia WhatsApp template convidando a agendar.</w:t>
+      </w:r>
+    </w:p>
+    <w:p>
+      <w:pPr>
+        <w:pStyle w:val="ListBullet"/>
+      </w:pPr>
+      <w:r>
+        <w:t>Sem disparo automático — evita spam e controla fluxo manualmente.</w:t>
+      </w:r>
+    </w:p>
+    <w:p>
+      <w:pPr>
+        <w:pStyle w:val="Heading1"/>
+      </w:pPr>
+      <w:r>
+        <w:t>14. Regras de Negócio — Termos e Consentimentos</w:t>
+      </w:r>
+    </w:p>
+    <w:p>
+      <w:pPr>
+        <w:pStyle w:val="ListBullet"/>
+      </w:pPr>
+      <w:r>
+        <w:t>TermoUso versionado: admin cria nova versão quando há alteração de texto. Versão anterior permanece imutável como evidência.</w:t>
+      </w:r>
+    </w:p>
+    <w:p>
+      <w:pPr>
+        <w:pStyle w:val="ListBullet"/>
+      </w:pPr>
+      <w:r>
+        <w:t>Assinatura do cliente: /termo/assinar/&lt;token&gt;/ apresenta o texto; cliente clica em "Aceito", sistema grava Consentimento com cliente, versao_termo, data, IP.</w:t>
+      </w:r>
+    </w:p>
+    <w:p>
+      <w:pPr>
+        <w:pStyle w:val="ListBullet"/>
+      </w:pPr>
+      <w:r>
+        <w:t>Termos pendentes: se cliente tiver atendimento mas não tiver Consentimento na versão atual, job ao criar atendimento envia e-mail enviar_termos_pendentes_email solicitando assinatura.</w:t>
+      </w:r>
+    </w:p>
+    <w:p>
+      <w:pPr>
+        <w:pStyle w:val="ListBullet"/>
+      </w:pPr>
+      <w:r>
+        <w:t>Prontuário exige Consentimento específico (diferente de termo geral). prontuario_consentimento registra aceite explícito antes da coleta de dados clínicos.</w:t>
+      </w:r>
+    </w:p>
+    <w:p>
+      <w:pPr>
+        <w:pStyle w:val="Heading1"/>
+      </w:pPr>
+      <w:r>
+        <w:t>15. LGPD e Compliance</w:t>
+      </w:r>
+    </w:p>
+    <w:p>
+      <w:pPr>
+        <w:pStyle w:val="ListBullet"/>
+      </w:pPr>
+      <w:r>
+        <w:t>Consentimentos granulares por canal em Cliente, cada um com timestamp e IP de origem. Captura no agendamento público.</w:t>
+      </w:r>
+    </w:p>
+    <w:p>
+      <w:pPr>
+        <w:pStyle w:val="ListBullet"/>
+      </w:pPr>
+      <w:r>
+        <w:t>DSAR (Direito do Titular): /lgpd/meus-dados/ — autenticado via OTP, exibe JSON ou HTML com todos os dados do cliente. Backend: LgpdService.exportar_dados_cliente (dados pessoais, preferências, atendimentos, avaliações NPS).</w:t>
+      </w:r>
+    </w:p>
+    <w:p>
+      <w:pPr>
+        <w:pStyle w:val="ListBullet"/>
+      </w:pPr>
+      <w:r>
+        <w:t>Direito ao esquecimento: LgpdService.esquecer_cliente anonimiza campos pessoais (nome → [ANONIMIZADO-&lt;pk&gt;], demais → None) e soft-delete.</w:t>
+      </w:r>
+    </w:p>
+    <w:p>
+      <w:pPr>
+        <w:pStyle w:val="ListBullet"/>
+      </w:pPr>
+      <w:r>
+        <w:t>Opt-out one-click: /lgpd/unsubscribe/&lt;token&gt;/ zera todos consents (aceita_comunicacao, consent_email_marketing, consent_whatsapp_nps).</w:t>
+      </w:r>
+    </w:p>
+    <w:p>
+      <w:pPr>
+        <w:pStyle w:val="ListBullet"/>
+      </w:pPr>
+      <w:r>
+        <w:t>Retenção: job lgpd_purgar (cron semanal domingo 03:00) aplica esquecer_cliente em clientes sem atendimento há mais de 2 anos (RETENCAO_CLIENTE_INATIVO_DIAS=730).</w:t>
+      </w:r>
+    </w:p>
+    <w:p>
+      <w:pPr>
+        <w:pStyle w:val="ListBullet"/>
+      </w:pPr>
+      <w:r>
+        <w:t>Log auditoria: LogAuditoria grava toda operação sensível (acesso prontuário, exportação relatório, alteração de consent, login admin). Retenção 1 ano.</w:t>
+      </w:r>
+    </w:p>
+    <w:p>
+      <w:pPr>
+        <w:pStyle w:val="ListBullet"/>
+      </w:pPr>
+      <w:r>
+        <w:t>DPIA: documento docs/DPIA.md registra impacto, riscos e mitigações.</w:t>
+      </w:r>
+    </w:p>
+    <w:p>
+      <w:pPr>
+        <w:pStyle w:val="Heading1"/>
+      </w:pPr>
+      <w:r>
+        <w:t>16. Segurança</w:t>
+      </w:r>
+    </w:p>
+    <w:p>
+      <w:pPr>
+        <w:pStyle w:val="ListBullet"/>
+      </w:pPr>
+      <w:r>
+        <w:t>CSP com nonce por request (ContentSecurityPolicyMiddleware). Bloqueia inline scripts não autorizados.</w:t>
+      </w:r>
+    </w:p>
+    <w:p>
+      <w:pPr>
+        <w:pStyle w:val="ListBullet"/>
+      </w:pPr>
+      <w:r>
+        <w:t>SecurityHeadersMiddleware: HSTS (1 ano + preload), X-Frame-Options DENY, X-Content-Type-Options nosniff, Referrer-Policy strict-origin-when-cross-origin, Cross-Origin-Opener-Policy same-origin.</w:t>
+      </w:r>
+    </w:p>
+    <w:p>
+      <w:pPr>
+        <w:pStyle w:val="ListBullet"/>
+      </w:pPr>
+      <w:r>
+        <w:t>CSRF: tokens em todos os formulários. SAMESITE=Lax. CSRF_COOKIE_SECURE em produção.</w:t>
+      </w:r>
+    </w:p>
+    <w:p>
+      <w:pPr>
+        <w:pStyle w:val="ListBullet"/>
+      </w:pPr>
+      <w:r>
+        <w:t>HTTPS forçado via SECURE_SSL_REDIRECT. Healthchecks (/healthz/, /health/) excluídos do redirect para probes HTTP internos do Railway.</w:t>
+      </w:r>
+    </w:p>
+    <w:p>
+      <w:pPr>
+        <w:pStyle w:val="ListBullet"/>
+      </w:pPr>
+      <w:r>
+        <w:t>django-axes: lockout de brute-force (5 tentativas por combinação IP+username, timeout 1h).</w:t>
+      </w:r>
+    </w:p>
+    <w:p>
+      <w:pPr>
+        <w:pStyle w:val="ListBullet"/>
+      </w:pPr>
+      <w:r>
+        <w:t>Rate limits defense-in-depth: OTP 5/min IP; verificação OTP 10/min; SMS 3/hora telefone + 10/hora IP + 60/hora global.</w:t>
+      </w:r>
+    </w:p>
+    <w:p>
+      <w:pPr>
+        <w:pStyle w:val="ListBullet"/>
+      </w:pPr>
+      <w:r>
+        <w:t>Zenvia webhook: IP allowlist + HMAC do payload via ZENVIA_WEBHOOK_SECRET.</w:t>
+      </w:r>
+    </w:p>
+    <w:p>
+      <w:pPr>
+        <w:pStyle w:val="ListBullet"/>
+      </w:pPr>
+      <w:r>
+        <w:t>Cron endpoint: X-Cron-Token validado com hmac.compare_digest.</w:t>
+      </w:r>
+    </w:p>
+    <w:p>
+      <w:pPr>
+        <w:pStyle w:val="ListBullet"/>
+      </w:pPr>
+      <w:r>
+        <w:t>Senhas: pbkdf2_sha256 padrão Django. Mínimo 10 caracteres (MinimumLengthValidator).</w:t>
+      </w:r>
+    </w:p>
+    <w:p>
+      <w:pPr>
+        <w:pStyle w:val="ListBullet"/>
+      </w:pPr>
+      <w:r>
+        <w:t>PII masking em logs: LogAuditoria grava hash de e-mail/telefone, nunca valor em texto puro.</w:t>
+      </w:r>
+    </w:p>
+    <w:p>
+      <w:pPr>
+        <w:pStyle w:val="ListBullet"/>
+      </w:pPr>
+      <w:r>
+        <w:t>Secrets via env var, nunca commitados. .env.example documenta.</w:t>
+      </w:r>
+    </w:p>
+    <w:p>
+      <w:pPr>
+        <w:pStyle w:val="Heading1"/>
+      </w:pPr>
+      <w:r>
+        <w:t>17. Integrações Externas</w:t>
+      </w:r>
+    </w:p>
+    <w:p>
+      <w:pPr>
+        <w:pStyle w:val="ListBullet"/>
+      </w:pPr>
+      <w:r>
+        <w:t>SMTP (Gmail App Password ou SendGrid): envio transacional e marketing por e-mail.</w:t>
+      </w:r>
+    </w:p>
+    <w:p>
+      <w:pPr>
+        <w:pStyle w:val="ListBullet"/>
+      </w:pPr>
+      <w:r>
+        <w:t>Meta WhatsApp Business API: templates aprovados para lembrete D-1 e NPS. Webhook /api/whatsapp/webhook/ para recebimento de status.</w:t>
+      </w:r>
+    </w:p>
+    <w:p>
+      <w:pPr>
+        <w:pStyle w:val="ListBullet"/>
+      </w:pPr>
+      <w:r>
+        <w:t>Zenvia SMS API v2: envio de OTP. Webhook /api/zenvia/webhook/ para delivery reports. Rate limit + IP allowlist + HMAC.</w:t>
+      </w:r>
+    </w:p>
+    <w:p>
+      <w:pPr>
+        <w:pStyle w:val="ListBullet"/>
+      </w:pPr>
+      <w:r>
+        <w:t>Cloudflare Turnstile: CAPTCHA invisível em OTP e confirmação de agendamento. Opcional (ativado via TURNSTILE_SITE_KEY).</w:t>
+      </w:r>
+    </w:p>
+    <w:p>
+      <w:pPr>
+        <w:pStyle w:val="ListBullet"/>
+      </w:pPr>
+      <w:r>
+        <w:t>Sentry (opcional): error reporting e tracing. Ativado quando SENTRY_DSN definido. send_default_pii=False.</w:t>
+      </w:r>
+    </w:p>
+    <w:p>
+      <w:pPr>
+        <w:pStyle w:val="ListBullet"/>
+      </w:pPr>
+      <w:r>
+        <w:t>cron-job.org (externo, gratuito): chama POST /cron/run/&lt;job&gt;/ nos horários definidos, com header X-Cron-Token.</w:t>
+      </w:r>
+    </w:p>
+    <w:p>
+      <w:pPr>
+        <w:pStyle w:val="Heading1"/>
+      </w:pPr>
+      <w:r>
+        <w:t>18. Observabilidade</w:t>
+      </w:r>
+    </w:p>
+    <w:p>
+      <w:pPr>
+        <w:pStyle w:val="ListBullet"/>
+      </w:pPr>
+      <w:r>
+        <w:t>/healthz/: liveness — retorna 200 com {"status": "alive"} se processo vivo. Usado pelo healthcheck do Railway.</w:t>
+      </w:r>
+    </w:p>
+    <w:p>
+      <w:pPr>
+        <w:pStyle w:val="ListBullet"/>
+      </w:pPr>
+      <w:r>
+        <w:t>/health/: readiness — checa DB + cache. Retorna 503 em degradação. Parâmetro ?celery=1 força check adicional de broker (se configurado).</w:t>
+      </w:r>
+    </w:p>
+    <w:p>
+      <w:pPr>
+        <w:pStyle w:val="ListBullet"/>
+      </w:pPr>
+      <w:r>
+        <w:t>Logging JSON estruturado em produção (python-json-logger). Nível WARNING root, INFO django, INFO app_shivazen.</w:t>
+      </w:r>
+    </w:p>
+    <w:p>
+      <w:pPr>
+        <w:pStyle w:val="ListBullet"/>
+      </w:pPr>
+      <w:r>
+        <w:t>Sentry integra Django via DjangoIntegration. TRACES_SAMPLE_RATE configurável (default 0.2).</w:t>
+      </w:r>
+    </w:p>
+    <w:p>
+      <w:pPr>
+        <w:pStyle w:val="ListBullet"/>
+      </w:pPr>
+      <w:r>
+        <w:t>LogAuditoria (DB): trilha imutável de operações sensíveis; admin consulta em /painel/auditoria/ com filtros.</w:t>
+      </w:r>
+    </w:p>
+    <w:p>
+      <w:pPr>
+        <w:pStyle w:val="ListBullet"/>
+      </w:pPr>
+      <w:r>
+        <w:t>Railway logs V2 (JSON): console do serviço acessível via CLI ou dashboard. Voláteis — sem retenção longa no free tier.</w:t>
+      </w:r>
+    </w:p>
+    <w:p>
+      <w:pPr>
+        <w:pStyle w:val="Heading1"/>
+      </w:pPr>
+      <w:r>
+        <w:t>19. Infraestrutura e Deploy</w:t>
+      </w:r>
+    </w:p>
+    <w:p>
+      <w:r>
+        <w:t>Configuração corrente no Railway free tier:</w:t>
       </w:r>
     </w:p>
     <w:tbl>
@@ -1234,7 +1906,7 @@
           </w:tcPr>
           <w:p>
             <w:r>
-              <w:t>Servico</w:t>
+              <w:t>Serviço</w:t>
             </w:r>
           </w:p>
         </w:tc>
@@ -1244,7 +1916,7 @@
           </w:tcPr>
           <w:p>
             <w:r>
-              <w:t>Configuracao</w:t>
+              <w:t>Configuração</w:t>
             </w:r>
           </w:p>
         </w:tc>
@@ -1276,7 +1948,7 @@
           </w:tcPr>
           <w:p>
             <w:r>
-              <w:t>Django + gunicorn (1 worker / 4 threads). Nixpacks build. Sleep apos 5min sem trafego.</w:t>
+              <w:t>Django + gunicorn (1 worker / 4 threads / timeout 120s). Nixpacks build. sleep após ~5min sem tráfego. Domínio web-production-465af.up.railway.app.</w:t>
             </w:r>
           </w:p>
         </w:tc>
@@ -1308,7 +1980,7 @@
           </w:tcPr>
           <w:p>
             <w:r>
-              <w:t>Managed Railway. 1GB volume. DATABASE_URL injetada.</w:t>
+              <w:t>Managed Railway. 1GB volume. DATABASE_URL injetada via referência de serviço.</w:t>
             </w:r>
           </w:p>
         </w:tc>
@@ -1340,7 +2012,7 @@
           </w:tcPr>
           <w:p>
             <w:r>
-              <w:t>cron-job.org chama endpoints HTTP a cada horario</w:t>
+              <w:t>cron-job.org chama endpoints HTTP com X-Cron-Token.</w:t>
             </w:r>
           </w:p>
         </w:tc>
@@ -1358,7 +2030,7 @@
     </w:tbl>
     <w:p>
       <w:r>
-        <w:t>Ambientes:</w:t>
+        <w:t>Ambientes Railway (mesmos serviços, vars separadas):</w:t>
       </w:r>
     </w:p>
     <w:p>
@@ -1366,7 +2038,7 @@
         <w:pStyle w:val="ListBullet"/>
       </w:pPr>
       <w:r>
-        <w:t>production: deploy automatico do branch main. Dominio web-production-465af.up.railway.app.</w:t>
+        <w:t>production: deploy automático do branch main via Railway GitHub integration. Healthcheck em /healthz/.</w:t>
       </w:r>
     </w:p>
     <w:p>
@@ -1374,12 +2046,12 @@
         <w:pStyle w:val="ListBullet"/>
       </w:pPr>
       <w:r>
-        <w:t>dev: deploy automatico do branch dev via deployment trigger. Ambiente de testes.</w:t>
+        <w:t>dev: deploy automático do branch dev via deployment trigger GraphQL. Usado para testes antes do merge em main.</w:t>
       </w:r>
     </w:p>
     <w:p>
       <w:r>
-        <w:t>Configuracao de build:</w:t>
+        <w:t>Configuração de build (railway.json):</w:t>
       </w:r>
     </w:p>
     <w:p>
@@ -1387,38 +2059,113 @@
         <w:pStyle w:val="ListBullet"/>
       </w:pPr>
       <w:r>
-        <w:t>railway.json define NIXPACKS build + startCommand que roda migrate, collectstatic e gunicorn. Healthcheck em /healthz/.</w:t>
+        <w:t>builder: NIXPACKS (detecção automática Django + requirements.txt).</w:t>
       </w:r>
     </w:p>
     <w:p>
       <w:pPr>
+        <w:pStyle w:val="ListBullet"/>
+      </w:pPr>
+      <w:r>
+        <w:t>startCommand: sh -c "python manage.py migrate --noinput &amp;&amp; python manage.py collectstatic --noinput --verbosity 0 &amp;&amp; exec gunicorn shivazen.wsgi --bind 0.0.0.0:${PORT:-8080} --workers 1 --threads 4 --timeout 120 --access-logfile - --error-logfile -".</w:t>
+      </w:r>
+    </w:p>
+    <w:p>
+      <w:pPr>
+        <w:pStyle w:val="ListBullet"/>
+      </w:pPr>
+      <w:r>
+        <w:t>healthcheckPath: /healthz/, healthcheckTimeout: 60s.</w:t>
+      </w:r>
+    </w:p>
+    <w:p>
+      <w:pPr>
+        <w:pStyle w:val="ListBullet"/>
+      </w:pPr>
+      <w:r>
+        <w:t>restartPolicyType: ON_FAILURE, maxRetries: 10.</w:t>
+      </w:r>
+    </w:p>
+    <w:p>
+      <w:pPr>
         <w:pStyle w:val="Heading1"/>
       </w:pPr>
       <w:r>
-        <w:t>12. API REST</w:t>
+        <w:t>20. API REST</w:t>
       </w:r>
     </w:p>
     <w:p>
       <w:r>
-        <w:t>API REST v1 disponivel em /api/ com drf-spectacular (OpenAPI 3.0). Autenticacao por Session + DRF Throttling (anon: 60/hour, user: 1000/hour). Paginacao PageNumber com 20 items.</w:t>
+        <w:t>API REST v1 em /api/ com drf-spectacular (OpenAPI 3.0). Schema em /api/schema/, Swagger UI em /api/docs/.</w:t>
+      </w:r>
+    </w:p>
+    <w:p>
+      <w:pPr>
+        <w:pStyle w:val="ListBullet"/>
+      </w:pPr>
+      <w:r>
+        <w:t>Autenticação: SessionAuthentication (cookie). Endpoints públicos (ex. listagem de procedimentos) usam AnonRateThrottle.</w:t>
+      </w:r>
+    </w:p>
+    <w:p>
+      <w:pPr>
+        <w:pStyle w:val="ListBullet"/>
+      </w:pPr>
+      <w:r>
+        <w:t>Throttling: anon 60/hora, user 1000/hora.</w:t>
+      </w:r>
+    </w:p>
+    <w:p>
+      <w:pPr>
+        <w:pStyle w:val="ListBullet"/>
+      </w:pPr>
+      <w:r>
+        <w:t>Paginação: PageNumberPagination, PAGE_SIZE 20.</w:t>
+      </w:r>
+    </w:p>
+    <w:p>
+      <w:pPr>
+        <w:pStyle w:val="ListBullet"/>
+      </w:pPr>
+      <w:r>
+        <w:t>Endpoints principais: GET /api/procedimentos/, GET /api/horarios-disponiveis/, GET /api/dias-disponiveis/.</w:t>
+      </w:r>
+    </w:p>
+    <w:p>
+      <w:pPr>
+        <w:pStyle w:val="ListBullet"/>
+      </w:pPr>
+      <w:r>
+        <w:t>Boas práticas DRF: serializers separados para leitura/escrita, componentização via COMPONENT_SPLIT_REQUEST.</w:t>
+      </w:r>
+    </w:p>
+    <w:p>
+      <w:pPr>
+        <w:pStyle w:val="Heading1"/>
+      </w:pPr>
+      <w:r>
+        <w:t>21. Testes</w:t>
       </w:r>
     </w:p>
     <w:p>
       <w:r>
-        <w:t>Schema auto-gerado em /api/schema/ (JSON/YAML). Swagger UI em /api/docs/. Endpoints principais expoem agendamentos, horarios disponiveis e procedimentos para leitura.</w:t>
+        <w:t>135 testes unitários + integração em app_shivazen/tests/. SQLite em memória (override em DATABASES quando sys.argv contém test ou env PYTEST_CURRENT_TEST setada).</w:t>
       </w:r>
     </w:p>
     <w:p>
       <w:pPr>
-        <w:pStyle w:val="Heading1"/>
+        <w:pStyle w:val="ListBullet"/>
       </w:pPr>
       <w:r>
-        <w:t>13. Testes</w:t>
+        <w:t>test_integration_booking: fluxo completo agendamento com OTP.</w:t>
       </w:r>
     </w:p>
     <w:p>
+      <w:pPr>
+        <w:pStyle w:val="ListBullet"/>
+      </w:pPr>
       <w:r>
-        <w:t>135 testes unitarios + integracao em app_shivazen/tests/. SQLite em memoria via conftest (DATABASES override quando sys.argv contem test ou PYTEST_CURRENT_TEST setado). Cobre:</w:t>
+        <w:t>test_otp: geração, expiração, rate limit.</w:t>
       </w:r>
     </w:p>
     <w:p>
@@ -1426,7 +2173,7 @@
         <w:pStyle w:val="ListBullet"/>
       </w:pPr>
       <w:r>
-        <w:t>Booking: fluxo completo com OTP.</w:t>
+        <w:t>test_integration_nps: envio de token, resposta, idempotência.</w:t>
       </w:r>
     </w:p>
     <w:p>
@@ -1434,7 +2181,7 @@
         <w:pStyle w:val="ListBullet"/>
       </w:pPr>
       <w:r>
-        <w:t>NPS: envio de token, resposta, idempotencia.</w:t>
+        <w:t>test_integration_packages: compra, consumo, expiração, finalização.</w:t>
       </w:r>
     </w:p>
     <w:p>
@@ -1442,7 +2189,7 @@
         <w:pStyle w:val="ListBullet"/>
       </w:pPr>
       <w:r>
-        <w:t>Pacotes: compra, consumo, expiracao.</w:t>
+        <w:t>test_whatsapp_webhook: HMAC, templates.</w:t>
       </w:r>
     </w:p>
     <w:p>
@@ -1450,7 +2197,7 @@
         <w:pStyle w:val="ListBullet"/>
       </w:pPr>
       <w:r>
-        <w:t>OTP: geracao, expiracao, rate limit.</w:t>
+        <w:t>test_security_utils: CSRF, IP extraction, LGPD services.</w:t>
       </w:r>
     </w:p>
     <w:p>
@@ -1458,7 +2205,7 @@
         <w:pStyle w:val="ListBullet"/>
       </w:pPr>
       <w:r>
-        <w:t>WhatsApp webhook: HMAC, templates.</w:t>
+        <w:t>test_validators: CPF, telefone BR, data nascimento.</w:t>
       </w:r>
     </w:p>
     <w:p>
@@ -1466,7 +2213,7 @@
         <w:pStyle w:val="ListBullet"/>
       </w:pPr>
       <w:r>
-        <w:t>Security utils: CSRF, IP extraction, LGPD services.</w:t>
+        <w:t>test_context_processors e test_decorators: helpers transversais.</w:t>
       </w:r>
     </w:p>
     <w:p>
@@ -1474,7 +2221,7 @@
         <w:pStyle w:val="ListBullet"/>
       </w:pPr>
       <w:r>
-        <w:t>Validators: CPF, telefone BR.</w:t>
+        <w:t>test_public_views: renderização de páginas públicas.</w:t>
       </w:r>
     </w:p>
     <w:p>
@@ -1482,15 +2229,31 @@
         <w:pStyle w:val="ListBullet"/>
       </w:pPr>
       <w:r>
-        <w:t>Context processors + decorators.</w:t>
+        <w:t>test_signals: hooks automáticos (auditoria, derivação status).</w:t>
       </w:r>
     </w:p>
     <w:p>
       <w:pPr>
+        <w:pStyle w:val="ListBullet"/>
+      </w:pPr>
+      <w:r>
+        <w:t>test_confirmar_agendamento: endpoint pós-lembrete.</w:t>
+      </w:r>
+    </w:p>
+    <w:p>
+      <w:pPr>
+        <w:pStyle w:val="ListBullet"/>
+      </w:pPr>
+      <w:r>
+        <w:t>test_gaps_coverage: cobertura adicional de edge-cases.</w:t>
+      </w:r>
+    </w:p>
+    <w:p>
+      <w:pPr>
         <w:pStyle w:val="Heading1"/>
       </w:pPr>
       <w:r>
-        <w:t>14. Variaveis de Ambiente</w:t>
+        <w:t>22. Variáveis de Ambiente</w:t>
       </w:r>
     </w:p>
     <w:tbl>
@@ -1511,7 +2274,7 @@
           </w:tcPr>
           <w:p>
             <w:r>
-              <w:t>Variavel</w:t>
+              <w:t>Variável</w:t>
             </w:r>
           </w:p>
         </w:tc>
@@ -1521,7 +2284,7 @@
           </w:tcPr>
           <w:p>
             <w:r>
-              <w:t>Obrigatoria?</w:t>
+              <w:t>Obrigatória?</w:t>
             </w:r>
           </w:p>
         </w:tc>
@@ -1531,7 +2294,7 @@
           </w:tcPr>
           <w:p>
             <w:r>
-              <w:t>Descricao</w:t>
+              <w:t>Descrição</w:t>
             </w:r>
           </w:p>
         </w:tc>
@@ -1563,7 +2326,7 @@
           </w:tcPr>
           <w:p>
             <w:r>
-              <w:t>Chave de assinatura. Min 50 chars aleatorios.</w:t>
+              <w:t>Chave de assinatura. Mínimo 50 caracteres aleatórios.</w:t>
             </w:r>
           </w:p>
         </w:tc>
@@ -1595,7 +2358,7 @@
           </w:tcPr>
           <w:p>
             <w:r>
-              <w:t>prod ou dev (seleciona settings).</w:t>
+              <w:t>prod ou dev — seleciona settings module.</w:t>
             </w:r>
           </w:p>
         </w:tc>
@@ -1627,7 +2390,7 @@
           </w:tcPr>
           <w:p>
             <w:r>
-              <w:t>URL postgres:// injetada pelo Railway.</w:t>
+              <w:t>postgres://... injetado pelo Railway.</w:t>
             </w:r>
           </w:p>
         </w:tc>
@@ -1659,7 +2422,7 @@
           </w:tcPr>
           <w:p>
             <w:r>
-              <w:t>Dominios separados por virgula.</w:t>
+              <w:t>Domínios separados por vírgula.</w:t>
             </w:r>
           </w:p>
         </w:tc>
@@ -1713,7 +2476,7 @@
           </w:tcPr>
           <w:p>
             <w:r>
-              <w:t>Nao</w:t>
+              <w:t>Não</w:t>
             </w:r>
           </w:p>
         </w:tc>
@@ -1755,7 +2518,7 @@
           </w:tcPr>
           <w:p>
             <w:r>
-              <w:t>Token para endpoint /cron/run/.</w:t>
+              <w:t>Token do endpoint /cron/run/ (32+ chars aleatórios).</w:t>
             </w:r>
           </w:p>
         </w:tc>
@@ -1787,7 +2550,7 @@
           </w:tcPr>
           <w:p>
             <w:r>
-              <w:t>SMTP host.</w:t>
+              <w:t>SMTP host (ex. smtp.gmail.com).</w:t>
             </w:r>
           </w:p>
         </w:tc>
@@ -1819,7 +2582,7 @@
           </w:tcPr>
           <w:p>
             <w:r>
-              <w:t>SMTP user.</w:t>
+              <w:t>Usuário SMTP.</w:t>
             </w:r>
           </w:p>
         </w:tc>
@@ -1851,7 +2614,7 @@
           </w:tcPr>
           <w:p>
             <w:r>
-              <w:t>SMTP password/app-password.</w:t>
+              <w:t>Senha/App Password SMTP.</w:t>
             </w:r>
           </w:p>
         </w:tc>
@@ -1873,7 +2636,7 @@
           </w:tcPr>
           <w:p>
             <w:r>
-              <w:t>Nao</w:t>
+              <w:t>Não</w:t>
             </w:r>
           </w:p>
         </w:tc>
@@ -1915,7 +2678,103 @@
           </w:tcPr>
           <w:p>
             <w:r>
-              <w:t>E-mail de remetente.</w:t>
+              <w:t>E-mail remetente.</w:t>
+            </w:r>
+          </w:p>
+        </w:tc>
+      </w:tr>
+      <w:tr>
+        <w:tc>
+          <w:tcPr>
+            <w:tcW w:type="dxa" w:w="3135"/>
+          </w:tcPr>
+          <w:p>
+            <w:r>
+              <w:t>ZENVIA_API_TOKEN</w:t>
+            </w:r>
+          </w:p>
+        </w:tc>
+        <w:tc>
+          <w:tcPr>
+            <w:tcW w:type="dxa" w:w="3135"/>
+          </w:tcPr>
+          <w:p>
+            <w:r>
+              <w:t>Sim (para OTP)</w:t>
+            </w:r>
+          </w:p>
+        </w:tc>
+        <w:tc>
+          <w:tcPr>
+            <w:tcW w:type="dxa" w:w="3135"/>
+          </w:tcPr>
+          <w:p>
+            <w:r>
+              <w:t>Token Zenvia v2.</w:t>
+            </w:r>
+          </w:p>
+        </w:tc>
+      </w:tr>
+      <w:tr>
+        <w:tc>
+          <w:tcPr>
+            <w:tcW w:type="dxa" w:w="3135"/>
+          </w:tcPr>
+          <w:p>
+            <w:r>
+              <w:t>ZENVIA_FROM</w:t>
+            </w:r>
+          </w:p>
+        </w:tc>
+        <w:tc>
+          <w:tcPr>
+            <w:tcW w:type="dxa" w:w="3135"/>
+          </w:tcPr>
+          <w:p>
+            <w:r>
+              <w:t>Sim (para OTP)</w:t>
+            </w:r>
+          </w:p>
+        </w:tc>
+        <w:tc>
+          <w:tcPr>
+            <w:tcW w:type="dxa" w:w="3135"/>
+          </w:tcPr>
+          <w:p>
+            <w:r>
+              <w:t>Identificador remetente SMS.</w:t>
+            </w:r>
+          </w:p>
+        </w:tc>
+      </w:tr>
+      <w:tr>
+        <w:tc>
+          <w:tcPr>
+            <w:tcW w:type="dxa" w:w="3135"/>
+          </w:tcPr>
+          <w:p>
+            <w:r>
+              <w:t>ZENVIA_WEBHOOK_SECRET</w:t>
+            </w:r>
+          </w:p>
+        </w:tc>
+        <w:tc>
+          <w:tcPr>
+            <w:tcW w:type="dxa" w:w="3135"/>
+          </w:tcPr>
+          <w:p>
+            <w:r>
+              <w:t>Não</w:t>
+            </w:r>
+          </w:p>
+        </w:tc>
+        <w:tc>
+          <w:tcPr>
+            <w:tcW w:type="dxa" w:w="3135"/>
+          </w:tcPr>
+          <w:p>
+            <w:r>
+              <w:t>HMAC do webhook Zenvia.</w:t>
             </w:r>
           </w:p>
         </w:tc>
@@ -1937,7 +2796,7 @@
           </w:tcPr>
           <w:p>
             <w:r>
-              <w:t>Nao</w:t>
+              <w:t>Não</w:t>
             </w:r>
           </w:p>
         </w:tc>
@@ -1947,7 +2806,7 @@
           </w:tcPr>
           <w:p>
             <w:r>
-              <w:t>CAPTCHA publico.</w:t>
+              <w:t>CAPTCHA Cloudflare público.</w:t>
             </w:r>
           </w:p>
         </w:tc>
@@ -1969,7 +2828,7 @@
           </w:tcPr>
           <w:p>
             <w:r>
-              <w:t>Nao</w:t>
+              <w:t>Não</w:t>
             </w:r>
           </w:p>
         </w:tc>
@@ -1979,71 +2838,7 @@
           </w:tcPr>
           <w:p>
             <w:r>
-              <w:t>CAPTCHA validacao server.</w:t>
-            </w:r>
-          </w:p>
-        </w:tc>
-      </w:tr>
-      <w:tr>
-        <w:tc>
-          <w:tcPr>
-            <w:tcW w:type="dxa" w:w="3135"/>
-          </w:tcPr>
-          <w:p>
-            <w:r>
-              <w:t>ZENVIA_API_TOKEN</w:t>
-            </w:r>
-          </w:p>
-        </w:tc>
-        <w:tc>
-          <w:tcPr>
-            <w:tcW w:type="dxa" w:w="3135"/>
-          </w:tcPr>
-          <w:p>
-            <w:r>
-              <w:t>Nao</w:t>
-            </w:r>
-          </w:p>
-        </w:tc>
-        <w:tc>
-          <w:tcPr>
-            <w:tcW w:type="dxa" w:w="3135"/>
-          </w:tcPr>
-          <w:p>
-            <w:r>
-              <w:t>SMS Zenvia.</w:t>
-            </w:r>
-          </w:p>
-        </w:tc>
-      </w:tr>
-      <w:tr>
-        <w:tc>
-          <w:tcPr>
-            <w:tcW w:type="dxa" w:w="3135"/>
-          </w:tcPr>
-          <w:p>
-            <w:r>
-              <w:t>ZENVIA_WEBHOOK_SECRET</w:t>
-            </w:r>
-          </w:p>
-        </w:tc>
-        <w:tc>
-          <w:tcPr>
-            <w:tcW w:type="dxa" w:w="3135"/>
-          </w:tcPr>
-          <w:p>
-            <w:r>
-              <w:t>Nao</w:t>
-            </w:r>
-          </w:p>
-        </w:tc>
-        <w:tc>
-          <w:tcPr>
-            <w:tcW w:type="dxa" w:w="3135"/>
-          </w:tcPr>
-          <w:p>
-            <w:r>
-              <w:t>HMAC webhook.</w:t>
+              <w:t>CAPTCHA Cloudflare server.</w:t>
             </w:r>
           </w:p>
         </w:tc>
@@ -2065,7 +2860,7 @@
           </w:tcPr>
           <w:p>
             <w:r>
-              <w:t>Nao</w:t>
+              <w:t>Não</w:t>
             </w:r>
           </w:p>
         </w:tc>
@@ -2075,7 +2870,7 @@
           </w:tcPr>
           <w:p>
             <w:r>
-              <w:t>Observabilidade.</w:t>
+              <w:t>Observabilidade — ativa Sentry quando presente.</w:t>
             </w:r>
           </w:p>
         </w:tc>
@@ -2087,7 +2882,7 @@
           </w:tcPr>
           <w:p>
             <w:r>
-              <w:t>REDIS_URL</w:t>
+              <w:t>SENTRY_TRACES_SAMPLE_RATE</w:t>
             </w:r>
           </w:p>
         </w:tc>
@@ -2097,7 +2892,7 @@
           </w:tcPr>
           <w:p>
             <w:r>
-              <w:t>Nao</w:t>
+              <w:t>Não</w:t>
             </w:r>
           </w:p>
         </w:tc>
@@ -2107,7 +2902,231 @@
           </w:tcPr>
           <w:p>
             <w:r>
-              <w:t>Se presente, ativa cache/sessions em Redis e Celery.</w:t>
+              <w:t>Default 0.2.</w:t>
+            </w:r>
+          </w:p>
+        </w:tc>
+      </w:tr>
+      <w:tr>
+        <w:tc>
+          <w:tcPr>
+            <w:tcW w:type="dxa" w:w="3135"/>
+          </w:tcPr>
+          <w:p>
+            <w:r>
+              <w:t>AXES_FAILURE_LIMIT</w:t>
+            </w:r>
+          </w:p>
+        </w:tc>
+        <w:tc>
+          <w:tcPr>
+            <w:tcW w:type="dxa" w:w="3135"/>
+          </w:tcPr>
+          <w:p>
+            <w:r>
+              <w:t>Não</w:t>
+            </w:r>
+          </w:p>
+        </w:tc>
+        <w:tc>
+          <w:tcPr>
+            <w:tcW w:type="dxa" w:w="3135"/>
+          </w:tcPr>
+          <w:p>
+            <w:r>
+              <w:t>Default 5 tentativas.</w:t>
+            </w:r>
+          </w:p>
+        </w:tc>
+      </w:tr>
+      <w:tr>
+        <w:tc>
+          <w:tcPr>
+            <w:tcW w:type="dxa" w:w="3135"/>
+          </w:tcPr>
+          <w:p>
+            <w:r>
+              <w:t>AXES_COOLOFF_TIME_HOURS</w:t>
+            </w:r>
+          </w:p>
+        </w:tc>
+        <w:tc>
+          <w:tcPr>
+            <w:tcW w:type="dxa" w:w="3135"/>
+          </w:tcPr>
+          <w:p>
+            <w:r>
+              <w:t>Não</w:t>
+            </w:r>
+          </w:p>
+        </w:tc>
+        <w:tc>
+          <w:tcPr>
+            <w:tcW w:type="dxa" w:w="3135"/>
+          </w:tcPr>
+          <w:p>
+            <w:r>
+              <w:t>Default 1 hora.</w:t>
+            </w:r>
+          </w:p>
+        </w:tc>
+      </w:tr>
+      <w:tr>
+        <w:tc>
+          <w:tcPr>
+            <w:tcW w:type="dxa" w:w="3135"/>
+          </w:tcPr>
+          <w:p>
+            <w:r>
+              <w:t>SMS_MAX_POR_HORA</w:t>
+            </w:r>
+          </w:p>
+        </w:tc>
+        <w:tc>
+          <w:tcPr>
+            <w:tcW w:type="dxa" w:w="3135"/>
+          </w:tcPr>
+          <w:p>
+            <w:r>
+              <w:t>Não</w:t>
+            </w:r>
+          </w:p>
+        </w:tc>
+        <w:tc>
+          <w:tcPr>
+            <w:tcW w:type="dxa" w:w="3135"/>
+          </w:tcPr>
+          <w:p>
+            <w:r>
+              <w:t>Default 3 SMS/hora por telefone.</w:t>
+            </w:r>
+          </w:p>
+        </w:tc>
+      </w:tr>
+      <w:tr>
+        <w:tc>
+          <w:tcPr>
+            <w:tcW w:type="dxa" w:w="3135"/>
+          </w:tcPr>
+          <w:p>
+            <w:r>
+              <w:t>SMS_MAX_POR_IP_HORA</w:t>
+            </w:r>
+          </w:p>
+        </w:tc>
+        <w:tc>
+          <w:tcPr>
+            <w:tcW w:type="dxa" w:w="3135"/>
+          </w:tcPr>
+          <w:p>
+            <w:r>
+              <w:t>Não</w:t>
+            </w:r>
+          </w:p>
+        </w:tc>
+        <w:tc>
+          <w:tcPr>
+            <w:tcW w:type="dxa" w:w="3135"/>
+          </w:tcPr>
+          <w:p>
+            <w:r>
+              <w:t>Default 10 SMS/hora por IP.</w:t>
+            </w:r>
+          </w:p>
+        </w:tc>
+      </w:tr>
+      <w:tr>
+        <w:tc>
+          <w:tcPr>
+            <w:tcW w:type="dxa" w:w="3135"/>
+          </w:tcPr>
+          <w:p>
+            <w:r>
+              <w:t>SMS_MAX_GLOBAL_HORA</w:t>
+            </w:r>
+          </w:p>
+        </w:tc>
+        <w:tc>
+          <w:tcPr>
+            <w:tcW w:type="dxa" w:w="3135"/>
+          </w:tcPr>
+          <w:p>
+            <w:r>
+              <w:t>Não</w:t>
+            </w:r>
+          </w:p>
+        </w:tc>
+        <w:tc>
+          <w:tcPr>
+            <w:tcW w:type="dxa" w:w="3135"/>
+          </w:tcPr>
+          <w:p>
+            <w:r>
+              <w:t>Default 60 SMS/hora global.</w:t>
+            </w:r>
+          </w:p>
+        </w:tc>
+      </w:tr>
+      <w:tr>
+        <w:tc>
+          <w:tcPr>
+            <w:tcW w:type="dxa" w:w="3135"/>
+          </w:tcPr>
+          <w:p>
+            <w:r>
+              <w:t>SITE_URL</w:t>
+            </w:r>
+          </w:p>
+        </w:tc>
+        <w:tc>
+          <w:tcPr>
+            <w:tcW w:type="dxa" w:w="3135"/>
+          </w:tcPr>
+          <w:p>
+            <w:r>
+              <w:t>Não</w:t>
+            </w:r>
+          </w:p>
+        </w:tc>
+        <w:tc>
+          <w:tcPr>
+            <w:tcW w:type="dxa" w:w="3135"/>
+          </w:tcPr>
+          <w:p>
+            <w:r>
+              <w:t>URL base (usada em links de NPS).</w:t>
+            </w:r>
+          </w:p>
+        </w:tc>
+      </w:tr>
+      <w:tr>
+        <w:tc>
+          <w:tcPr>
+            <w:tcW w:type="dxa" w:w="3135"/>
+          </w:tcPr>
+          <w:p>
+            <w:r>
+              <w:t>CLINIC_NAME</w:t>
+            </w:r>
+          </w:p>
+        </w:tc>
+        <w:tc>
+          <w:tcPr>
+            <w:tcW w:type="dxa" w:w="3135"/>
+          </w:tcPr>
+          <w:p>
+            <w:r>
+              <w:t>Não</w:t>
+            </w:r>
+          </w:p>
+        </w:tc>
+        <w:tc>
+          <w:tcPr>
+            <w:tcW w:type="dxa" w:w="3135"/>
+          </w:tcPr>
+          <w:p>
+            <w:r>
+              <w:t>Default "Shiva Zen".</w:t>
             </w:r>
           </w:p>
         </w:tc>
@@ -2118,7 +3137,7 @@
         <w:pStyle w:val="Heading1"/>
       </w:pPr>
       <w:r>
-        <w:t>15. Limites de Escala</w:t>
+        <w:t>23. Limites de Escala</w:t>
       </w:r>
     </w:p>
     <w:p>
@@ -2126,7 +3145,7 @@
         <w:pStyle w:val="ListBullet"/>
       </w:pPr>
       <w:r>
-        <w:t>Volume alvo: ate 40 clientes/mes, ~50 agendamentos/mes, ~200 e-mails/mes.</w:t>
+        <w:t>Volume alvo: até 40 clientes/mês, ~50 agendamentos/mês, ~200 e-mails/mês.</w:t>
       </w:r>
     </w:p>
     <w:p>
@@ -2134,7 +3153,7 @@
         <w:pStyle w:val="ListBullet"/>
       </w:pPr>
       <w:r>
-        <w:t>Servico web dorme apos 5min sem trafego (cold start ~10-30s primeiro request).</w:t>
+        <w:t>Serviço web dorme após ~5min sem tráfego — cold start 10-30s no primeiro request.</w:t>
       </w:r>
     </w:p>
     <w:p>
@@ -2142,7 +3161,7 @@
         <w:pStyle w:val="ListBullet"/>
       </w:pPr>
       <w:r>
-        <w:t>SMTP sincrono limita request a ~3s.</w:t>
+        <w:t>SMTP síncrono limita request a ~3s.</w:t>
       </w:r>
     </w:p>
     <w:p>
@@ -2150,7 +3169,7 @@
         <w:pStyle w:val="ListBullet"/>
       </w:pPr>
       <w:r>
-        <w:t>Sem fila de retry para e-mails: se SMTP falhar, cliente vê erro.</w:t>
+        <w:t>Sem fila de retry para e-mails: SMTP falhando faz o cliente ver erro.</w:t>
       </w:r>
     </w:p>
     <w:p>
@@ -2158,7 +3177,7 @@
         <w:pStyle w:val="ListBullet"/>
       </w:pPr>
       <w:r>
-        <w:t>Postgres Railway free: 1GB. Suficiente para ~10k clientes.</w:t>
+        <w:t>Postgres Railway free: 1GB. Suficiente para ~10 mil clientes.</w:t>
       </w:r>
     </w:p>
     <w:p>
@@ -2166,7 +3185,7 @@
         <w:pStyle w:val="ListBullet"/>
       </w:pPr>
       <w:r>
-        <w:t>Cache local em cada worker (LocMemCache) — nao compartilha entre workers multiplos. Irrelevante com 1 worker gunicorn.</w:t>
+        <w:t>Cache LocMemCache por worker — não compartilha entre workers; irrelevante com 1 worker gunicorn.</w:t>
       </w:r>
     </w:p>
     <w:p>
@@ -2174,7 +3193,7 @@
         <w:pStyle w:val="ListBullet"/>
       </w:pPr>
       <w:r>
-        <w:t>Jobs agendados executam via cron-job.org — depende de disponibilidade do servico externo (99.9% historico).</w:t>
+        <w:t>Jobs agendados dependem de cron-job.org (SLA histórico ~99.9%).</w:t>
       </w:r>
     </w:p>
     <w:p>
@@ -2182,12 +3201,12 @@
         <w:pStyle w:val="Heading1"/>
       </w:pPr>
       <w:r>
-        <w:t>16. E-mail Sincrono (decisao corrente)</w:t>
+        <w:t>24. E-mail Síncrono (decisão corrente)</w:t>
       </w:r>
     </w:p>
     <w:p>
       <w:r>
-        <w:t>O sistema envia e-mails dentro do request HTTP do Django. Latencia tipica 2-3 segundos. Mitigacao UX: spinner global em forms com atributo data-loading-msg, mostrando "Enviando confirmacao por e-mail..." durante o submit. Forms marcados:</w:t>
+        <w:t>O sistema envia e-mails dentro do request HTTP do Django. Latência típica 2-3 segundos. Mitigação UX: spinner global em forms com atributo data-loading-msg, exibindo "Enviando confirmação por e-mail..." durante o submit. Forms marcados:</w:t>
       </w:r>
     </w:p>
     <w:p>
@@ -2195,7 +3214,7 @@
         <w:pStyle w:val="ListBullet"/>
       </w:pPr>
       <w:r>
-        <w:t>agendamento_publico.html (confirmacao)</w:t>
+        <w:t>agendamento_publico.html (confirmação de agendamento)</w:t>
       </w:r>
     </w:p>
     <w:p>
@@ -2219,7 +3238,7 @@
         <w:pStyle w:val="ListBullet"/>
       </w:pPr>
       <w:r>
-        <w:t>contato.html (contato publico)</w:t>
+        <w:t>contato.html (contato público)</w:t>
       </w:r>
     </w:p>
     <w:p>
@@ -2227,12 +3246,12 @@
         <w:pStyle w:val="ListBullet"/>
       </w:pPr>
       <w:r>
-        <w:t>lista_espera.html (lista de espera)</w:t>
+        <w:t>lista_espera.html (inscrição)</w:t>
       </w:r>
     </w:p>
     <w:p>
       <w:r>
-        <w:t>Criterio para migrar a envio assincrono (Celery + Redis + worker): volume &gt;200 clientes/mes, SMTP com latencia &gt;3s, ou campanhas em batch. Documento completo em docs/EMAIL_ASYNC_VS_SYNC.md.</w:t>
+        <w:t>Critério para migrar a assíncrono (Celery + Redis + worker): volume &gt; 200 clientes/mês, SMTP &gt; 3s ou campanhas em batch. Documento completo em docs/EMAIL_ASYNC_VS_SYNC.md.</w:t>
       </w:r>
     </w:p>
     <w:p>
@@ -2240,92 +3259,62 @@
         <w:pStyle w:val="Heading1"/>
       </w:pPr>
       <w:r>
-        <w:t>17. Roadmap Infraestrutura</w:t>
+        <w:t>25. Roadmap de Infraestrutura</w:t>
       </w:r>
     </w:p>
     <w:p>
       <w:r>
-        <w:t>Proximos passos recomendados, em ordem de prioridade:</w:t>
+        <w:t>Próximos passos recomendados, em ordem de prioridade:</w:t>
       </w:r>
     </w:p>
     <w:p>
-      <w:pPr>
-        <w:pStyle w:val="ListBullet"/>
-      </w:pPr>
       <w:r>
-        <w:t>1. Backup automatizado Postgres (dump diario + copia off-Railway — LGPD).</w:t>
+        <w:t>1. Backup automatizado do Postgres (dump diário + cópia off-Railway) — crítico LGPD.</w:t>
       </w:r>
     </w:p>
     <w:p>
-      <w:pPr>
-        <w:pStyle w:val="ListBullet"/>
-      </w:pPr>
       <w:r>
-        <w:t>2. Sentry: free tier cobre volume atual.</w:t>
+        <w:t>2. Sentry: free tier cobre o volume atual.</w:t>
       </w:r>
     </w:p>
     <w:p>
-      <w:pPr>
-        <w:pStyle w:val="ListBullet"/>
-      </w:pPr>
       <w:r>
-        <w:t>3. Cloudflare na frente (free tier): WAF + DDoS + cache static.</w:t>
+        <w:t>3. Cloudflare na frente (free tier): WAF + DDoS + cache de estáticos.</w:t>
       </w:r>
     </w:p>
     <w:p>
-      <w:pPr>
-        <w:pStyle w:val="ListBullet"/>
-      </w:pPr>
       <w:r>
-        <w:t>4. Storage S3/R2 para MEDIA_ROOT (fotos prontuario / profissionais).</w:t>
+        <w:t>4. Storage S3/R2 para MEDIA_ROOT (fotos de prontuário, avatares).</w:t>
       </w:r>
     </w:p>
     <w:p>
-      <w:pPr>
-        <w:pStyle w:val="ListBullet"/>
-      </w:pPr>
       <w:r>
         <w:t>5. Uptime monitor externo (BetterStack ou UptimeRobot).</w:t>
       </w:r>
     </w:p>
     <w:p>
-      <w:pPr>
-        <w:pStyle w:val="ListBullet"/>
-      </w:pPr>
       <w:r>
-        <w:t>6. Log aggregation externa (BetterStack Logs): Railway logs sao volateis; LGPD requer retencao de auditoria.</w:t>
+        <w:t>6. Log aggregation externa (BetterStack Logs): logs do Railway são voláteis; LGPD exige retenção de auditoria.</w:t>
       </w:r>
     </w:p>
     <w:p>
-      <w:pPr>
-        <w:pStyle w:val="ListBullet"/>
-      </w:pPr>
       <w:r>
-        <w:t>7. Staging dev isolado com Postgres proprio (custo ~$5/mes adicional).</w:t>
+        <w:t>7. Staging dev isolado com Postgres próprio (~$5/mês adicional).</w:t>
       </w:r>
     </w:p>
     <w:p>
-      <w:pPr>
-        <w:pStyle w:val="ListBullet"/>
-      </w:pPr>
       <w:r>
-        <w:t>8. Redis + Celery quando volume &gt;200 clientes/mes (custo +$10-15/mes).</w:t>
+        <w:t>8. Redis + Celery quando volume &gt; 200 clientes/mês (+$10-15/mês).</w:t>
       </w:r>
     </w:p>
     <w:p>
-      <w:pPr>
-        <w:pStyle w:val="ListBullet"/>
-      </w:pPr>
       <w:r>
-        <w:t>9. Custom domain com HTTPS (Railway emite certificado).</w:t>
+        <w:t>9. Custom domain com HTTPS (Railway emite certificado automático).</w:t>
       </w:r>
     </w:p>
     <w:p>
-      <w:pPr>
-        <w:pStyle w:val="ListBullet"/>
-      </w:pPr>
       <w:r>
-        <w:t>10. Split app_shivazen em apps menores quando crescer para &gt;50 models.</w:t>
+        <w:t>10. Split do app_shivazen em apps menores se crescer para &gt; 50 modelos.</w:t>
       </w:r>
     </w:p>
     <w:p/>
@@ -2357,7 +3346,7 @@
       <w:jc w:val="center"/>
     </w:pPr>
     <w:r>
-      <w:t xml:space="preserve">Shiva Zen — Documentacao Tecnica — pagina </w:t>
+      <w:t xml:space="preserve">Shiva Zen — Documentação Técnica — página </w:t>
     </w:r>
     <w:r>
       <w:fldChar w:fldCharType="begin"/>

</xml_diff>